<commit_message>
CV updated and work exp added
</commit_message>
<xml_diff>
--- a/Files/CV_OLID_HASAN_BHUIYAN.docx
+++ b/Files/CV_OLID_HASAN_BHUIYAN.docx
@@ -338,7 +338,7 @@
           </mc:Choice>
           <mc:Fallback>
             <w:pict>
-              <v:shape w14:anchorId="11C9B63B" id="Graphic 1" o:spid="_x0000_s1026" style="position:absolute;margin-left:46.8pt;margin-top:3.8pt;width:518.45pt;height:.1pt;z-index:-15728640;visibility:visible;mso-wrap-style:square;mso-wrap-distance-left:0;mso-wrap-distance-top:0;mso-wrap-distance-right:0;mso-wrap-distance-bottom:0;mso-position-horizontal:absolute;mso-position-horizontal-relative:page;mso-position-vertical:absolute;mso-position-vertical-relative:text;v-text-anchor:top" coordsize="6584315,1270" o:gfxdata="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" path="m,l6583692,e" filled="f" strokeweight=".14039mm">
+              <v:shape w14:anchorId="574F6DB4" id="Graphic 1" o:spid="_x0000_s1026" style="position:absolute;margin-left:46.8pt;margin-top:3.8pt;width:518.45pt;height:.1pt;z-index:-15728640;visibility:visible;mso-wrap-style:square;mso-wrap-distance-left:0;mso-wrap-distance-top:0;mso-wrap-distance-right:0;mso-wrap-distance-bottom:0;mso-position-horizontal:absolute;mso-position-horizontal-relative:page;mso-position-vertical:absolute;mso-position-vertical-relative:text;v-text-anchor:top" coordsize="6584315,1270" o:gfxdata="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" path="m,l6583692,e" filled="f" strokeweight=".14039mm">
                 <v:path arrowok="t"/>
                 <w10:wrap type="topAndBottom" anchorx="page"/>
               </v:shape>
@@ -572,7 +572,7 @@
         <w:rPr>
           <w:spacing w:val="-2"/>
         </w:rPr>
-        <w:t>71</w:t>
+        <w:t>80</w:t>
       </w:r>
       <w:r>
         <w:rPr>
@@ -1095,7 +1095,7 @@
           </mc:Choice>
           <mc:Fallback>
             <w:pict>
-              <v:shape w14:anchorId="407F6362" id="Graphic 2" o:spid="_x0000_s1026" style="position:absolute;margin-left:46.8pt;margin-top:3.8pt;width:518.45pt;height:.1pt;z-index:-15728128;visibility:visible;mso-wrap-style:square;mso-wrap-distance-left:0;mso-wrap-distance-top:0;mso-wrap-distance-right:0;mso-wrap-distance-bottom:0;mso-position-horizontal:absolute;mso-position-horizontal-relative:page;mso-position-vertical:absolute;mso-position-vertical-relative:text;v-text-anchor:top" coordsize="6584315,1270" o:gfxdata="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" path="m,l6583692,e" filled="f" strokeweight=".14039mm">
+              <v:shape w14:anchorId="5E59A5AA" id="Graphic 2" o:spid="_x0000_s1026" style="position:absolute;margin-left:46.8pt;margin-top:3.8pt;width:518.45pt;height:.1pt;z-index:-15728128;visibility:visible;mso-wrap-style:square;mso-wrap-distance-left:0;mso-wrap-distance-top:0;mso-wrap-distance-right:0;mso-wrap-distance-bottom:0;mso-position-horizontal:absolute;mso-position-horizontal-relative:page;mso-position-vertical:absolute;mso-position-vertical-relative:text;v-text-anchor:top" coordsize="6584315,1270" o:gfxdata="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" path="m,l6583692,e" filled="f" strokeweight=".14039mm">
                 <v:path arrowok="t"/>
                 <w10:wrap type="topAndBottom" anchorx="page"/>
               </v:shape>
@@ -1185,13 +1185,7 @@
         <w:rPr>
           <w:spacing w:val="-11"/>
         </w:rPr>
-        <w:t>.</w:t>
-      </w:r>
-      <w:r>
-        <w:rPr>
-          <w:spacing w:val="-11"/>
-        </w:rPr>
-        <w:t xml:space="preserve"> </w:t>
+        <w:t>, LLMs</w:t>
       </w:r>
     </w:p>
     <w:p>
@@ -1481,7 +1475,7 @@
           </mc:Choice>
           <mc:Fallback>
             <w:pict>
-              <v:shape w14:anchorId="3ACB3C0D" id="Graphic 2" o:spid="_x0000_s1026" style="position:absolute;margin-left:46.8pt;margin-top:3.8pt;width:518.45pt;height:.1pt;z-index:-15721984;visibility:visible;mso-wrap-style:square;mso-wrap-distance-left:0;mso-wrap-distance-top:0;mso-wrap-distance-right:0;mso-wrap-distance-bottom:0;mso-position-horizontal:absolute;mso-position-horizontal-relative:page;mso-position-vertical:absolute;mso-position-vertical-relative:text;v-text-anchor:top" coordsize="6584315,1270" o:gfxdata="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" path="m,l6583692,e" filled="f" strokeweight=".14039mm">
+              <v:shape w14:anchorId="2CDE9499" id="Graphic 2" o:spid="_x0000_s1026" style="position:absolute;margin-left:46.8pt;margin-top:3.8pt;width:518.45pt;height:.1pt;z-index:-15721984;visibility:visible;mso-wrap-style:square;mso-wrap-distance-left:0;mso-wrap-distance-top:0;mso-wrap-distance-right:0;mso-wrap-distance-bottom:0;mso-position-horizontal:absolute;mso-position-horizontal-relative:page;mso-position-vertical:absolute;mso-position-vertical-relative:text;v-text-anchor:top" coordsize="6584315,1270" o:gfxdata="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" path="m,l6583692,e" filled="f" strokeweight=".14039mm">
                 <v:path arrowok="t"/>
                 <w10:wrap type="topAndBottom" anchorx="page"/>
               </v:shape>
@@ -1522,35 +1516,7 @@
         <w:rPr>
           <w:spacing w:val="-2"/>
         </w:rPr>
-        <w:t xml:space="preserve">On Detecting Malicious Code Injection </w:t>
-      </w:r>
-      <w:proofErr w:type="gramStart"/>
-      <w:r>
-        <w:rPr>
-          <w:spacing w:val="-2"/>
-        </w:rPr>
-        <w:t>By</w:t>
-      </w:r>
-      <w:proofErr w:type="gramEnd"/>
-      <w:r>
-        <w:rPr>
-          <w:spacing w:val="-2"/>
-        </w:rPr>
-        <w:t xml:space="preserve"> Monitoring Multi-</w:t>
-      </w:r>
-      <w:proofErr w:type="gramStart"/>
-      <w:r>
-        <w:rPr>
-          <w:spacing w:val="-2"/>
-        </w:rPr>
-        <w:t>level</w:t>
-      </w:r>
-      <w:proofErr w:type="gramEnd"/>
-      <w:r>
-        <w:rPr>
-          <w:spacing w:val="-2"/>
-        </w:rPr>
-        <w:t xml:space="preserve"> Container Act</w:t>
+        <w:t>On Detecting Malicious Code Injection By Monitoring Multi-level Container Act</w:t>
       </w:r>
       <w:r>
         <w:rPr>
@@ -1973,21 +1939,7 @@
         <w:rPr>
           <w:spacing w:val="-4"/>
         </w:rPr>
-        <w:t xml:space="preserve">CVE, Git, </w:t>
-      </w:r>
-      <w:proofErr w:type="spellStart"/>
-      <w:r>
-        <w:rPr>
-          <w:spacing w:val="-4"/>
-        </w:rPr>
-        <w:t>eBPF</w:t>
-      </w:r>
-      <w:proofErr w:type="spellEnd"/>
-      <w:r>
-        <w:rPr>
-          <w:spacing w:val="-4"/>
-        </w:rPr>
-        <w:t>.</w:t>
+        <w:t>CVE, Git, eBPF.</w:t>
       </w:r>
     </w:p>
     <w:p>
@@ -2005,32 +1957,162 @@
       </w:pPr>
     </w:p>
     <w:p>
-      <w:pPr>
-        <w:tabs>
-          <w:tab w:val="left" w:pos="1021"/>
-          <w:tab w:val="left" w:pos="1023"/>
-        </w:tabs>
-        <w:spacing w:before="10" w:line="249" w:lineRule="auto"/>
-        <w:ind w:right="935"/>
+      <w:r>
+        <w:rPr>
+          <w:color w:val="EE0000"/>
+          <w:w w:val="105"/>
+        </w:rPr>
+        <w:t xml:space="preserve">       </w:t>
+      </w:r>
+      <w:r>
+        <w:rPr>
+          <w:color w:val="EE0000"/>
+          <w:w w:val="105"/>
+        </w:rPr>
+        <w:t>E</w:t>
+      </w:r>
+      <w:r>
+        <w:rPr>
+          <w:color w:val="EE0000"/>
+          <w:w w:val="105"/>
+        </w:rPr>
+        <w:t>XPERIENCE AS REVIEWER</w:t>
+      </w:r>
+    </w:p>
+    <w:p>
+      <w:pPr>
+        <w:pStyle w:val="BodyText"/>
+        <w:spacing w:before="6"/>
+        <w:ind w:left="0"/>
         <w:jc w:val="both"/>
         <w:rPr>
-          <w:spacing w:val="-4"/>
-        </w:rPr>
-      </w:pPr>
-    </w:p>
-    <w:p>
-      <w:pPr>
-        <w:tabs>
-          <w:tab w:val="left" w:pos="1021"/>
-          <w:tab w:val="left" w:pos="1023"/>
-        </w:tabs>
-        <w:spacing w:before="10" w:line="249" w:lineRule="auto"/>
-        <w:ind w:right="935"/>
+          <w:sz w:val="4"/>
+        </w:rPr>
+      </w:pPr>
+      <w:r>
+        <w:rPr>
+          <w:noProof/>
+          <w:sz w:val="4"/>
+        </w:rPr>
+        <mc:AlternateContent>
+          <mc:Choice Requires="wps">
+            <w:drawing>
+              <wp:anchor distT="0" distB="0" distL="0" distR="0" simplePos="0" relativeHeight="487604736" behindDoc="1" locked="0" layoutInCell="1" allowOverlap="1" wp14:anchorId="1024ED6A" wp14:editId="73B4B101">
+                <wp:simplePos x="0" y="0"/>
+                <wp:positionH relativeFrom="page">
+                  <wp:posOffset>594359</wp:posOffset>
+                </wp:positionH>
+                <wp:positionV relativeFrom="paragraph">
+                  <wp:posOffset>48104</wp:posOffset>
+                </wp:positionV>
+                <wp:extent cx="6584315" cy="1270"/>
+                <wp:effectExtent l="0" t="0" r="0" b="0"/>
+                <wp:wrapTopAndBottom/>
+                <wp:docPr id="697234300" name="Graphic 1"/>
+                <wp:cNvGraphicFramePr>
+                  <a:graphicFrameLocks xmlns:a="http://schemas.openxmlformats.org/drawingml/2006/main"/>
+                </wp:cNvGraphicFramePr>
+                <a:graphic xmlns:a="http://schemas.openxmlformats.org/drawingml/2006/main">
+                  <a:graphicData uri="http://schemas.microsoft.com/office/word/2010/wordprocessingShape">
+                    <wps:wsp>
+                      <wps:cNvSpPr>
+                        <a:spLocks/>
+                      </wps:cNvSpPr>
+                      <wps:spPr>
+                        <a:xfrm>
+                          <a:off x="0" y="0"/>
+                          <a:ext cx="6584315" cy="1270"/>
+                        </a:xfrm>
+                        <a:custGeom>
+                          <a:avLst/>
+                          <a:gdLst/>
+                          <a:ahLst/>
+                          <a:cxnLst/>
+                          <a:rect l="l" t="t" r="r" b="b"/>
+                          <a:pathLst>
+                            <a:path w="6584315">
+                              <a:moveTo>
+                                <a:pt x="0" y="0"/>
+                              </a:moveTo>
+                              <a:lnTo>
+                                <a:pt x="6583692" y="0"/>
+                              </a:lnTo>
+                            </a:path>
+                          </a:pathLst>
+                        </a:custGeom>
+                        <a:ln w="5054">
+                          <a:solidFill>
+                            <a:srgbClr val="000000"/>
+                          </a:solidFill>
+                          <a:prstDash val="solid"/>
+                        </a:ln>
+                      </wps:spPr>
+                      <wps:bodyPr wrap="square" lIns="0" tIns="0" rIns="0" bIns="0" rtlCol="0">
+                        <a:prstTxWarp prst="textNoShape">
+                          <a:avLst/>
+                        </a:prstTxWarp>
+                        <a:noAutofit/>
+                      </wps:bodyPr>
+                    </wps:wsp>
+                  </a:graphicData>
+                </a:graphic>
+              </wp:anchor>
+            </w:drawing>
+          </mc:Choice>
+          <mc:Fallback>
+            <w:pict>
+              <v:shape w14:anchorId="4CF40520" id="Graphic 1" o:spid="_x0000_s1026" style="position:absolute;margin-left:46.8pt;margin-top:3.8pt;width:518.45pt;height:.1pt;z-index:-15711744;visibility:visible;mso-wrap-style:square;mso-wrap-distance-left:0;mso-wrap-distance-top:0;mso-wrap-distance-right:0;mso-wrap-distance-bottom:0;mso-position-horizontal:absolute;mso-position-horizontal-relative:page;mso-position-vertical:absolute;mso-position-vertical-relative:text;v-text-anchor:top" coordsize="6584315,1270" o:gfxdata="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" path="m,l6583692,e" filled="f" strokeweight=".14039mm">
+                <v:path arrowok="t"/>
+                <w10:wrap type="topAndBottom" anchorx="page"/>
+              </v:shape>
+            </w:pict>
+          </mc:Fallback>
+        </mc:AlternateContent>
+      </w:r>
+    </w:p>
+    <w:p>
+      <w:pPr>
+        <w:pStyle w:val="BodyText"/>
+        <w:numPr>
+          <w:ilvl w:val="0"/>
+          <w:numId w:val="4"/>
+        </w:numPr>
+        <w:spacing w:before="60"/>
         <w:jc w:val="both"/>
         <w:rPr>
-          <w:spacing w:val="-4"/>
-        </w:rPr>
-      </w:pPr>
+          <w:spacing w:val="-2"/>
+        </w:rPr>
+      </w:pPr>
+      <w:r>
+        <w:rPr>
+          <w:spacing w:val="-2"/>
+        </w:rPr>
+        <w:t xml:space="preserve">Humanities and Social Sciences Communications </w:t>
+      </w:r>
+      <w:hyperlink r:id="rId18" w:history="1">
+        <w:r>
+          <w:rPr>
+            <w:rStyle w:val="Hyperlink"/>
+            <w:spacing w:val="-2"/>
+          </w:rPr>
+          <w:t>[Springer Nature]</w:t>
+        </w:r>
+      </w:hyperlink>
+      <w:r>
+        <w:rPr>
+          <w:spacing w:val="-2"/>
+        </w:rPr>
+        <w:t xml:space="preserve"> </w:t>
+      </w:r>
+      <w:hyperlink r:id="rId19" w:history="1">
+        <w:r>
+          <w:rPr>
+            <w:rStyle w:val="Hyperlink"/>
+            <w:spacing w:val="-2"/>
+          </w:rPr>
+          <w:t>[Certificate]</w:t>
+        </w:r>
+      </w:hyperlink>
     </w:p>
     <w:p>
       <w:pPr>
@@ -2159,7 +2241,7 @@
           </mc:Choice>
           <mc:Fallback>
             <w:pict>
-              <v:shape w14:anchorId="01E7497D" id="Graphic 3" o:spid="_x0000_s1026" style="position:absolute;margin-left:46.8pt;margin-top:3.8pt;width:518.45pt;height:.1pt;z-index:-15724032;visibility:visible;mso-wrap-style:square;mso-wrap-distance-left:0;mso-wrap-distance-top:0;mso-wrap-distance-right:0;mso-wrap-distance-bottom:0;mso-position-horizontal:absolute;mso-position-horizontal-relative:page;mso-position-vertical:absolute;mso-position-vertical-relative:text;v-text-anchor:top" coordsize="6584315,1270" o:gfxdata="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" path="m,l6583692,e" filled="f" strokeweight=".14039mm">
+              <v:shape w14:anchorId="6ADA82CA" id="Graphic 3" o:spid="_x0000_s1026" style="position:absolute;margin-left:46.8pt;margin-top:3.8pt;width:518.45pt;height:.1pt;z-index:-15724032;visibility:visible;mso-wrap-style:square;mso-wrap-distance-left:0;mso-wrap-distance-top:0;mso-wrap-distance-right:0;mso-wrap-distance-bottom:0;mso-position-horizontal:absolute;mso-position-horizontal-relative:page;mso-position-vertical:absolute;mso-position-vertical-relative:text;v-text-anchor:top" coordsize="6584315,1270" o:gfxdata="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" path="m,l6583692,e" filled="f" strokeweight=".14039mm">
                 <v:path arrowok="t"/>
                 <w10:wrap type="topAndBottom" anchorx="page"/>
               </v:shape>
@@ -2383,175 +2465,6 @@
         </w:rPr>
         <w:t xml:space="preserve"> Winner.</w:t>
       </w:r>
-    </w:p>
-    <w:p>
-      <w:pPr>
-        <w:pStyle w:val="BodyText"/>
-        <w:spacing w:before="60"/>
-        <w:ind w:left="0"/>
-        <w:jc w:val="both"/>
-        <w:rPr>
-          <w:spacing w:val="-2"/>
-        </w:rPr>
-      </w:pPr>
-    </w:p>
-    <w:p>
-      <w:r>
-        <w:rPr>
-          <w:color w:val="EE0000"/>
-          <w:w w:val="105"/>
-        </w:rPr>
-        <w:t xml:space="preserve">       </w:t>
-      </w:r>
-      <w:r>
-        <w:rPr>
-          <w:color w:val="EE0000"/>
-          <w:w w:val="105"/>
-        </w:rPr>
-        <w:t>E</w:t>
-      </w:r>
-      <w:r>
-        <w:rPr>
-          <w:color w:val="EE0000"/>
-          <w:w w:val="105"/>
-        </w:rPr>
-        <w:t>XPERIENCE AS REVIEWER</w:t>
-      </w:r>
-    </w:p>
-    <w:p>
-      <w:pPr>
-        <w:pStyle w:val="BodyText"/>
-        <w:spacing w:before="6"/>
-        <w:ind w:left="0"/>
-        <w:jc w:val="both"/>
-        <w:rPr>
-          <w:sz w:val="4"/>
-        </w:rPr>
-      </w:pPr>
-      <w:r>
-        <w:rPr>
-          <w:noProof/>
-          <w:sz w:val="4"/>
-        </w:rPr>
-        <mc:AlternateContent>
-          <mc:Choice Requires="wps">
-            <w:drawing>
-              <wp:anchor distT="0" distB="0" distL="0" distR="0" simplePos="0" relativeHeight="487596544" behindDoc="1" locked="0" layoutInCell="1" allowOverlap="1" wp14:anchorId="285342C0" wp14:editId="1D349625">
-                <wp:simplePos x="0" y="0"/>
-                <wp:positionH relativeFrom="page">
-                  <wp:posOffset>594359</wp:posOffset>
-                </wp:positionH>
-                <wp:positionV relativeFrom="paragraph">
-                  <wp:posOffset>48104</wp:posOffset>
-                </wp:positionV>
-                <wp:extent cx="6584315" cy="1270"/>
-                <wp:effectExtent l="0" t="0" r="0" b="0"/>
-                <wp:wrapTopAndBottom/>
-                <wp:docPr id="697234300" name="Graphic 1"/>
-                <wp:cNvGraphicFramePr>
-                  <a:graphicFrameLocks xmlns:a="http://schemas.openxmlformats.org/drawingml/2006/main"/>
-                </wp:cNvGraphicFramePr>
-                <a:graphic xmlns:a="http://schemas.openxmlformats.org/drawingml/2006/main">
-                  <a:graphicData uri="http://schemas.microsoft.com/office/word/2010/wordprocessingShape">
-                    <wps:wsp>
-                      <wps:cNvSpPr>
-                        <a:spLocks/>
-                      </wps:cNvSpPr>
-                      <wps:spPr>
-                        <a:xfrm>
-                          <a:off x="0" y="0"/>
-                          <a:ext cx="6584315" cy="1270"/>
-                        </a:xfrm>
-                        <a:custGeom>
-                          <a:avLst/>
-                          <a:gdLst/>
-                          <a:ahLst/>
-                          <a:cxnLst/>
-                          <a:rect l="l" t="t" r="r" b="b"/>
-                          <a:pathLst>
-                            <a:path w="6584315">
-                              <a:moveTo>
-                                <a:pt x="0" y="0"/>
-                              </a:moveTo>
-                              <a:lnTo>
-                                <a:pt x="6583692" y="0"/>
-                              </a:lnTo>
-                            </a:path>
-                          </a:pathLst>
-                        </a:custGeom>
-                        <a:ln w="5054">
-                          <a:solidFill>
-                            <a:srgbClr val="000000"/>
-                          </a:solidFill>
-                          <a:prstDash val="solid"/>
-                        </a:ln>
-                      </wps:spPr>
-                      <wps:bodyPr wrap="square" lIns="0" tIns="0" rIns="0" bIns="0" rtlCol="0">
-                        <a:prstTxWarp prst="textNoShape">
-                          <a:avLst/>
-                        </a:prstTxWarp>
-                        <a:noAutofit/>
-                      </wps:bodyPr>
-                    </wps:wsp>
-                  </a:graphicData>
-                </a:graphic>
-              </wp:anchor>
-            </w:drawing>
-          </mc:Choice>
-          <mc:Fallback>
-            <w:pict>
-              <v:shape w14:anchorId="470407FC" id="Graphic 1" o:spid="_x0000_s1026" style="position:absolute;margin-left:46.8pt;margin-top:3.8pt;width:518.45pt;height:.1pt;z-index:-15719936;visibility:visible;mso-wrap-style:square;mso-wrap-distance-left:0;mso-wrap-distance-top:0;mso-wrap-distance-right:0;mso-wrap-distance-bottom:0;mso-position-horizontal:absolute;mso-position-horizontal-relative:page;mso-position-vertical:absolute;mso-position-vertical-relative:text;v-text-anchor:top" coordsize="6584315,1270" o:gfxdata="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" path="m,l6583692,e" filled="f" strokeweight=".14039mm">
-                <v:path arrowok="t"/>
-                <w10:wrap type="topAndBottom" anchorx="page"/>
-              </v:shape>
-            </w:pict>
-          </mc:Fallback>
-        </mc:AlternateContent>
-      </w:r>
-    </w:p>
-    <w:p>
-      <w:pPr>
-        <w:pStyle w:val="BodyText"/>
-        <w:numPr>
-          <w:ilvl w:val="0"/>
-          <w:numId w:val="4"/>
-        </w:numPr>
-        <w:spacing w:before="60"/>
-        <w:jc w:val="both"/>
-        <w:rPr>
-          <w:spacing w:val="-2"/>
-        </w:rPr>
-      </w:pPr>
-      <w:r>
-        <w:rPr>
-          <w:spacing w:val="-2"/>
-        </w:rPr>
-        <w:t xml:space="preserve">Humanities and Social Sciences Communications </w:t>
-      </w:r>
-      <w:hyperlink r:id="rId18" w:history="1">
-        <w:r>
-          <w:rPr>
-            <w:rStyle w:val="Hyperlink"/>
-            <w:spacing w:val="-2"/>
-          </w:rPr>
-          <w:t>[Springer Nature]</w:t>
-        </w:r>
-      </w:hyperlink>
-      <w:r>
-        <w:rPr>
-          <w:spacing w:val="-2"/>
-        </w:rPr>
-        <w:t xml:space="preserve"> </w:t>
-      </w:r>
-      <w:hyperlink r:id="rId19" w:history="1">
-        <w:r>
-          <w:rPr>
-            <w:rStyle w:val="Hyperlink"/>
-            <w:spacing w:val="-2"/>
-          </w:rPr>
-          <w:t>[Certificate]</w:t>
-        </w:r>
-      </w:hyperlink>
     </w:p>
     <w:p>
       <w:pPr>
@@ -2669,7 +2582,7 @@
           </mc:Choice>
           <mc:Fallback>
             <w:pict>
-              <v:shape w14:anchorId="1AE217B9" id="Graphic 1" o:spid="_x0000_s1026" style="position:absolute;margin-left:46.8pt;margin-top:3.8pt;width:518.45pt;height:.1pt;z-index:-15717888;visibility:visible;mso-wrap-style:square;mso-wrap-distance-left:0;mso-wrap-distance-top:0;mso-wrap-distance-right:0;mso-wrap-distance-bottom:0;mso-position-horizontal:absolute;mso-position-horizontal-relative:page;mso-position-vertical:absolute;mso-position-vertical-relative:text;v-text-anchor:top" coordsize="6584315,1270" o:gfxdata="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" path="m,l6583692,e" filled="f" strokeweight=".14039mm">
+              <v:shape w14:anchorId="6698368C" id="Graphic 1" o:spid="_x0000_s1026" style="position:absolute;margin-left:46.8pt;margin-top:3.8pt;width:518.45pt;height:.1pt;z-index:-15717888;visibility:visible;mso-wrap-style:square;mso-wrap-distance-left:0;mso-wrap-distance-top:0;mso-wrap-distance-right:0;mso-wrap-distance-bottom:0;mso-position-horizontal:absolute;mso-position-horizontal-relative:page;mso-position-vertical:absolute;mso-position-vertical-relative:text;v-text-anchor:top" coordsize="6584315,1270" o:gfxdata="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" path="m,l6583692,e" filled="f" strokeweight=".14039mm">
                 <v:path arrowok="t"/>
                 <w10:wrap type="topAndBottom" anchorx="page"/>
               </v:shape>
@@ -2757,13 +2670,19 @@
         <w:rPr>
           <w:spacing w:val="-2"/>
         </w:rPr>
-        <w:t>, University of California - Riverside</w:t>
-      </w:r>
-      <w:r>
-        <w:rPr>
-          <w:spacing w:val="-2"/>
-        </w:rPr>
-        <w:t xml:space="preserve">                                                                                                        </w:t>
+        <w:t xml:space="preserve">, University of California </w:t>
+      </w:r>
+      <w:r>
+        <w:rPr>
+          <w:spacing w:val="-2"/>
+        </w:rPr>
+        <w:t>–</w:t>
+      </w:r>
+      <w:r>
+        <w:rPr>
+          <w:spacing w:val="-2"/>
+        </w:rPr>
+        <w:t xml:space="preserve"> Riverside</w:t>
       </w:r>
     </w:p>
     <w:p>
@@ -2783,9 +2702,50 @@
         <w:rPr>
           <w:spacing w:val="-2"/>
         </w:rPr>
+        <w:t>CS 09B [</w:t>
+      </w:r>
+      <w:hyperlink r:id="rId20" w:history="1">
+        <w:r>
+          <w:rPr>
+            <w:rStyle w:val="Hyperlink"/>
+            <w:spacing w:val="-2"/>
+          </w:rPr>
+          <w:t>Data Oriented Introduction to Computing II</w:t>
+        </w:r>
+      </w:hyperlink>
+      <w:r>
+        <w:rPr>
+          <w:spacing w:val="-2"/>
+        </w:rPr>
+        <w:t>]            September 2025 – December 2025</w:t>
+      </w:r>
+      <w:r>
+        <w:rPr>
+          <w:spacing w:val="-2"/>
+        </w:rPr>
+        <w:t xml:space="preserve">                                                                                                       </w:t>
+      </w:r>
+    </w:p>
+    <w:p>
+      <w:pPr>
+        <w:pStyle w:val="BodyText"/>
+        <w:numPr>
+          <w:ilvl w:val="1"/>
+          <w:numId w:val="4"/>
+        </w:numPr>
+        <w:spacing w:before="60"/>
+        <w:jc w:val="both"/>
+        <w:rPr>
+          <w:spacing w:val="-2"/>
+        </w:rPr>
+      </w:pPr>
+      <w:r>
+        <w:rPr>
+          <w:spacing w:val="-2"/>
+        </w:rPr>
         <w:t xml:space="preserve">CS 170 </w:t>
       </w:r>
-      <w:hyperlink r:id="rId20" w:history="1">
+      <w:hyperlink r:id="rId21" w:history="1">
         <w:r>
           <w:rPr>
             <w:rStyle w:val="Hyperlink"/>
@@ -2798,7 +2758,21 @@
             <w:rStyle w:val="Hyperlink"/>
             <w:spacing w:val="-2"/>
           </w:rPr>
-          <w:t>Introduction to Artificial Intelligence</w:t>
+          <w:t>Introducti</w:t>
+        </w:r>
+        <w:r>
+          <w:rPr>
+            <w:rStyle w:val="Hyperlink"/>
+            <w:spacing w:val="-2"/>
+          </w:rPr>
+          <w:t>o</w:t>
+        </w:r>
+        <w:r>
+          <w:rPr>
+            <w:rStyle w:val="Hyperlink"/>
+            <w:spacing w:val="-2"/>
+          </w:rPr>
+          <w:t>n to Artificial Intelligence</w:t>
         </w:r>
         <w:r>
           <w:rPr>
@@ -2811,7 +2785,7 @@
       <w:r>
         <w:t xml:space="preserve"> </w:t>
       </w:r>
-      <w:hyperlink r:id="rId21" w:history="1">
+      <w:hyperlink r:id="rId22" w:history="1">
         <w:r>
           <w:rPr>
             <w:rStyle w:val="Hyperlink"/>
@@ -2853,7 +2827,7 @@
         </w:rPr>
         <w:t xml:space="preserve">CS 163 </w:t>
       </w:r>
-      <w:hyperlink r:id="rId22" w:history="1">
+      <w:hyperlink r:id="rId23" w:history="1">
         <w:r>
           <w:rPr>
             <w:rStyle w:val="Hyperlink"/>
@@ -2868,7 +2842,7 @@
         </w:rPr>
         <w:t xml:space="preserve"> </w:t>
       </w:r>
-      <w:hyperlink r:id="rId23" w:history="1">
+      <w:hyperlink r:id="rId24" w:history="1">
         <w:r>
           <w:rPr>
             <w:rStyle w:val="Hyperlink"/>
@@ -2925,7 +2899,7 @@
         </w:rPr>
         <w:t xml:space="preserve">, </w:t>
       </w:r>
-      <w:hyperlink r:id="rId24" w:history="1">
+      <w:hyperlink r:id="rId25" w:history="1">
         <w:r>
           <w:rPr>
             <w:rStyle w:val="Hyperlink"/>
@@ -3114,7 +3088,7 @@
           </mc:Choice>
           <mc:Fallback>
             <w:pict>
-              <v:shape w14:anchorId="5B6F2AB9" id="Graphic 1" o:spid="_x0000_s1026" style="position:absolute;margin-left:46.8pt;margin-top:3.8pt;width:518.45pt;height:.1pt;z-index:-15715840;visibility:visible;mso-wrap-style:square;mso-wrap-distance-left:0;mso-wrap-distance-top:0;mso-wrap-distance-right:0;mso-wrap-distance-bottom:0;mso-position-horizontal:absolute;mso-position-horizontal-relative:page;mso-position-vertical:absolute;mso-position-vertical-relative:text;v-text-anchor:top" coordsize="6584315,1270" o:gfxdata="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" path="m,l6583692,e" filled="f" strokeweight=".14039mm">
+              <v:shape w14:anchorId="0FD4D121" id="Graphic 1" o:spid="_x0000_s1026" style="position:absolute;margin-left:46.8pt;margin-top:3.8pt;width:518.45pt;height:.1pt;z-index:-15715840;visibility:visible;mso-wrap-style:square;mso-wrap-distance-left:0;mso-wrap-distance-top:0;mso-wrap-distance-right:0;mso-wrap-distance-bottom:0;mso-position-horizontal:absolute;mso-position-horizontal-relative:page;mso-position-vertical:absolute;mso-position-vertical-relative:text;v-text-anchor:top" coordsize="6584315,1270" o:gfxdata="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" path="m,l6583692,e" filled="f" strokeweight=".14039mm">
                 <v:path arrowok="t"/>
                 <w10:wrap type="topAndBottom" anchorx="page"/>
               </v:shape>
@@ -3153,7 +3127,7 @@
         </w:rPr>
         <w:t xml:space="preserve"> </w:t>
       </w:r>
-      <w:hyperlink r:id="rId25" w:history="1">
+      <w:hyperlink r:id="rId26" w:history="1">
         <w:r>
           <w:rPr>
             <w:rStyle w:val="Hyperlink"/>
@@ -3168,7 +3142,7 @@
         </w:rPr>
         <w:t xml:space="preserve"> </w:t>
       </w:r>
-      <w:hyperlink r:id="rId26" w:history="1">
+      <w:hyperlink r:id="rId27" w:history="1">
         <w:r>
           <w:rPr>
             <w:rStyle w:val="Hyperlink"/>
@@ -3183,7 +3157,7 @@
         </w:rPr>
         <w:t xml:space="preserve"> </w:t>
       </w:r>
-      <w:hyperlink r:id="rId27" w:history="1">
+      <w:hyperlink r:id="rId28" w:history="1">
         <w:r>
           <w:rPr>
             <w:rStyle w:val="Hyperlink"/>
@@ -3260,7 +3234,7 @@
         </w:rPr>
         <w:t xml:space="preserve">Stackoverflow Search Engine </w:t>
       </w:r>
-      <w:hyperlink r:id="rId28" w:history="1">
+      <w:hyperlink r:id="rId29" w:history="1">
         <w:r>
           <w:rPr>
             <w:rStyle w:val="Hyperlink"/>
@@ -3275,7 +3249,7 @@
         </w:rPr>
         <w:t xml:space="preserve"> </w:t>
       </w:r>
-      <w:hyperlink r:id="rId29" w:history="1">
+      <w:hyperlink r:id="rId30" w:history="1">
         <w:r>
           <w:rPr>
             <w:rStyle w:val="Hyperlink"/>
@@ -3382,7 +3356,7 @@
         </w:rPr>
         <w:t xml:space="preserve">Bangla Caption Generator for Images </w:t>
       </w:r>
-      <w:hyperlink r:id="rId30" w:history="1">
+      <w:hyperlink r:id="rId31" w:history="1">
         <w:r>
           <w:rPr>
             <w:rStyle w:val="Hyperlink"/>
@@ -3510,145 +3484,6 @@
           <w:spacing w:val="-2"/>
         </w:rPr>
         <w:t xml:space="preserve">Bangla Digit Recognition </w:t>
-      </w:r>
-      <w:hyperlink r:id="rId31" w:history="1">
-        <w:r>
-          <w:rPr>
-            <w:rStyle w:val="Hyperlink"/>
-            <w:spacing w:val="-2"/>
-          </w:rPr>
-          <w:t>[Code</w:t>
-        </w:r>
-        <w:r>
-          <w:rPr>
-            <w:rStyle w:val="Hyperlink"/>
-            <w:spacing w:val="-2"/>
-          </w:rPr>
-          <w:t xml:space="preserve"> and Report</w:t>
-        </w:r>
-        <w:r>
-          <w:rPr>
-            <w:rStyle w:val="Hyperlink"/>
-            <w:spacing w:val="-2"/>
-          </w:rPr>
-          <w:t>]</w:t>
-        </w:r>
-      </w:hyperlink>
-      <w:r>
-        <w:rPr>
-          <w:spacing w:val="-2"/>
-        </w:rPr>
-        <w:t xml:space="preserve">                                                                     </w:t>
-      </w:r>
-      <w:r>
-        <w:rPr>
-          <w:i/>
-          <w:iCs/>
-          <w:spacing w:val="-2"/>
-        </w:rPr>
-        <w:t>Jan</w:t>
-      </w:r>
-      <w:r>
-        <w:rPr>
-          <w:i/>
-          <w:iCs/>
-          <w:spacing w:val="-2"/>
-        </w:rPr>
-        <w:t xml:space="preserve"> 202</w:t>
-      </w:r>
-      <w:r>
-        <w:rPr>
-          <w:i/>
-          <w:iCs/>
-          <w:spacing w:val="-2"/>
-        </w:rPr>
-        <w:t>3</w:t>
-      </w:r>
-      <w:r>
-        <w:rPr>
-          <w:i/>
-          <w:iCs/>
-          <w:spacing w:val="-2"/>
-        </w:rPr>
-        <w:t xml:space="preserve"> – </w:t>
-      </w:r>
-      <w:r>
-        <w:rPr>
-          <w:i/>
-          <w:iCs/>
-          <w:spacing w:val="-2"/>
-        </w:rPr>
-        <w:t>Feb</w:t>
-      </w:r>
-      <w:r>
-        <w:rPr>
-          <w:i/>
-          <w:iCs/>
-          <w:spacing w:val="-2"/>
-        </w:rPr>
-        <w:t xml:space="preserve"> 202</w:t>
-      </w:r>
-      <w:r>
-        <w:rPr>
-          <w:i/>
-          <w:iCs/>
-          <w:spacing w:val="-2"/>
-        </w:rPr>
-        <w:t>3</w:t>
-      </w:r>
-    </w:p>
-    <w:p>
-      <w:pPr>
-        <w:pStyle w:val="BodyText"/>
-        <w:numPr>
-          <w:ilvl w:val="1"/>
-          <w:numId w:val="4"/>
-        </w:numPr>
-        <w:spacing w:before="60"/>
-        <w:rPr>
-          <w:spacing w:val="-2"/>
-        </w:rPr>
-      </w:pPr>
-      <w:r>
-        <w:rPr>
-          <w:spacing w:val="-2"/>
-        </w:rPr>
-        <w:t xml:space="preserve">A CNN model is built from scratch. The applied model showed 77% independent test accuracy </w:t>
-      </w:r>
-    </w:p>
-    <w:p>
-      <w:pPr>
-        <w:pStyle w:val="BodyText"/>
-        <w:spacing w:before="60"/>
-        <w:ind w:left="1885"/>
-        <w:rPr>
-          <w:spacing w:val="-2"/>
-        </w:rPr>
-      </w:pPr>
-      <w:r>
-        <w:rPr>
-          <w:spacing w:val="-2"/>
-        </w:rPr>
-        <w:t>and 91% validation accuracy.</w:t>
-      </w:r>
-    </w:p>
-    <w:p>
-      <w:pPr>
-        <w:pStyle w:val="BodyText"/>
-        <w:numPr>
-          <w:ilvl w:val="0"/>
-          <w:numId w:val="4"/>
-        </w:numPr>
-        <w:spacing w:before="60"/>
-        <w:rPr>
-          <w:spacing w:val="-2"/>
-        </w:rPr>
-      </w:pPr>
-      <w:r>
-        <w:rPr>
-          <w:spacing w:val="-2"/>
-        </w:rPr>
-        <w:t xml:space="preserve">TCP Libra </w:t>
       </w:r>
       <w:hyperlink r:id="rId32" w:history="1">
         <w:r>
@@ -3677,7 +3512,7 @@
         <w:rPr>
           <w:spacing w:val="-2"/>
         </w:rPr>
-        <w:t xml:space="preserve">                                                                                                </w:t>
+        <w:t xml:space="preserve">                                                                     </w:t>
       </w:r>
       <w:r>
         <w:rPr>
@@ -3685,7 +3520,7 @@
           <w:iCs/>
           <w:spacing w:val="-2"/>
         </w:rPr>
-        <w:t>Nov</w:t>
+        <w:t>Jan</w:t>
       </w:r>
       <w:r>
         <w:rPr>
@@ -3701,7 +3536,7 @@
           <w:iCs/>
           <w:spacing w:val="-2"/>
         </w:rPr>
-        <w:t>1</w:t>
+        <w:t>3</w:t>
       </w:r>
       <w:r>
         <w:rPr>
@@ -3733,7 +3568,7 @@
           <w:iCs/>
           <w:spacing w:val="-2"/>
         </w:rPr>
-        <w:t>2</w:t>
+        <w:t>3</w:t>
       </w:r>
     </w:p>
     <w:p>
@@ -3752,13 +3587,23 @@
         <w:rPr>
           <w:spacing w:val="-2"/>
         </w:rPr>
-        <w:t>A</w:t>
-      </w:r>
-      <w:r>
-        <w:rPr>
-          <w:spacing w:val="-2"/>
-        </w:rPr>
-        <w:t xml:space="preserve"> congestion control algorithm implemented successfully in NS3</w:t>
+        <w:t xml:space="preserve">A CNN model is built from scratch. The applied model showed 77% independent test accuracy </w:t>
+      </w:r>
+    </w:p>
+    <w:p>
+      <w:pPr>
+        <w:pStyle w:val="BodyText"/>
+        <w:spacing w:before="60"/>
+        <w:ind w:left="1885"/>
+        <w:rPr>
+          <w:spacing w:val="-2"/>
+        </w:rPr>
+      </w:pPr>
+      <w:r>
+        <w:rPr>
+          <w:spacing w:val="-2"/>
+        </w:rPr>
+        <w:t>and 91% validation accuracy.</w:t>
       </w:r>
     </w:p>
     <w:p>
@@ -3777,7 +3622,92 @@
         <w:rPr>
           <w:spacing w:val="-2"/>
         </w:rPr>
-        <w:t>Others</w:t>
+        <w:t xml:space="preserve">TCP Libra </w:t>
+      </w:r>
+      <w:hyperlink r:id="rId33" w:history="1">
+        <w:r>
+          <w:rPr>
+            <w:rStyle w:val="Hyperlink"/>
+            <w:spacing w:val="-2"/>
+          </w:rPr>
+          <w:t>[Code</w:t>
+        </w:r>
+        <w:r>
+          <w:rPr>
+            <w:rStyle w:val="Hyperlink"/>
+            <w:spacing w:val="-2"/>
+          </w:rPr>
+          <w:t xml:space="preserve"> and Report</w:t>
+        </w:r>
+        <w:r>
+          <w:rPr>
+            <w:rStyle w:val="Hyperlink"/>
+            <w:spacing w:val="-2"/>
+          </w:rPr>
+          <w:t>]</w:t>
+        </w:r>
+      </w:hyperlink>
+      <w:r>
+        <w:rPr>
+          <w:spacing w:val="-2"/>
+        </w:rPr>
+        <w:t xml:space="preserve">                                                                                                </w:t>
+      </w:r>
+      <w:r>
+        <w:rPr>
+          <w:i/>
+          <w:iCs/>
+          <w:spacing w:val="-2"/>
+        </w:rPr>
+        <w:t>Nov</w:t>
+      </w:r>
+      <w:r>
+        <w:rPr>
+          <w:i/>
+          <w:iCs/>
+          <w:spacing w:val="-2"/>
+        </w:rPr>
+        <w:t xml:space="preserve"> 202</w:t>
+      </w:r>
+      <w:r>
+        <w:rPr>
+          <w:i/>
+          <w:iCs/>
+          <w:spacing w:val="-2"/>
+        </w:rPr>
+        <w:t>1</w:t>
+      </w:r>
+      <w:r>
+        <w:rPr>
+          <w:i/>
+          <w:iCs/>
+          <w:spacing w:val="-2"/>
+        </w:rPr>
+        <w:t xml:space="preserve"> – </w:t>
+      </w:r>
+      <w:r>
+        <w:rPr>
+          <w:i/>
+          <w:iCs/>
+          <w:spacing w:val="-2"/>
+        </w:rPr>
+        <w:t>Feb</w:t>
+      </w:r>
+      <w:r>
+        <w:rPr>
+          <w:i/>
+          <w:iCs/>
+          <w:spacing w:val="-2"/>
+        </w:rPr>
+        <w:t xml:space="preserve"> 202</w:t>
+      </w:r>
+      <w:r>
+        <w:rPr>
+          <w:i/>
+          <w:iCs/>
+          <w:spacing w:val="-2"/>
+        </w:rPr>
+        <w:t>2</w:t>
       </w:r>
     </w:p>
     <w:p>
@@ -3792,7 +3722,51 @@
           <w:spacing w:val="-2"/>
         </w:rPr>
       </w:pPr>
-      <w:hyperlink r:id="rId33" w:history="1">
+      <w:r>
+        <w:rPr>
+          <w:spacing w:val="-2"/>
+        </w:rPr>
+        <w:t>A</w:t>
+      </w:r>
+      <w:r>
+        <w:rPr>
+          <w:spacing w:val="-2"/>
+        </w:rPr>
+        <w:t xml:space="preserve"> congestion control algorithm implemented successfully in NS3</w:t>
+      </w:r>
+    </w:p>
+    <w:p>
+      <w:pPr>
+        <w:pStyle w:val="BodyText"/>
+        <w:numPr>
+          <w:ilvl w:val="0"/>
+          <w:numId w:val="4"/>
+        </w:numPr>
+        <w:spacing w:before="60"/>
+        <w:rPr>
+          <w:spacing w:val="-2"/>
+        </w:rPr>
+      </w:pPr>
+      <w:r>
+        <w:rPr>
+          <w:spacing w:val="-2"/>
+        </w:rPr>
+        <w:t>Others</w:t>
+      </w:r>
+    </w:p>
+    <w:p>
+      <w:pPr>
+        <w:pStyle w:val="BodyText"/>
+        <w:numPr>
+          <w:ilvl w:val="1"/>
+          <w:numId w:val="4"/>
+        </w:numPr>
+        <w:spacing w:before="60"/>
+        <w:rPr>
+          <w:spacing w:val="-2"/>
+        </w:rPr>
+      </w:pPr>
+      <w:hyperlink r:id="rId34" w:history="1">
         <w:r>
           <w:rPr>
             <w:rStyle w:val="Hyperlink"/>
@@ -3807,7 +3781,7 @@
         </w:rPr>
         <w:t xml:space="preserve">, </w:t>
       </w:r>
-      <w:hyperlink r:id="rId34" w:history="1">
+      <w:hyperlink r:id="rId35" w:history="1">
         <w:r>
           <w:rPr>
             <w:rStyle w:val="Hyperlink"/>
@@ -3822,22 +3796,13 @@
         </w:rPr>
         <w:t xml:space="preserve">, </w:t>
       </w:r>
-      <w:hyperlink r:id="rId35" w:history="1">
-        <w:proofErr w:type="spellStart"/>
+      <w:hyperlink r:id="rId36" w:history="1">
         <w:r>
           <w:rPr>
             <w:rStyle w:val="Hyperlink"/>
             <w:spacing w:val="-2"/>
           </w:rPr>
-          <w:t>nPuzzle</w:t>
-        </w:r>
-        <w:proofErr w:type="spellEnd"/>
-        <w:r>
-          <w:rPr>
-            <w:rStyle w:val="Hyperlink"/>
-            <w:spacing w:val="-2"/>
-          </w:rPr>
-          <w:t xml:space="preserve"> (A* Search)</w:t>
+          <w:t>nPuzzle (A* Search)</w:t>
         </w:r>
       </w:hyperlink>
       <w:r>
@@ -3846,7 +3811,7 @@
         </w:rPr>
         <w:t xml:space="preserve">, </w:t>
       </w:r>
-      <w:hyperlink r:id="rId36" w:history="1">
+      <w:hyperlink r:id="rId37" w:history="1">
         <w:r>
           <w:rPr>
             <w:rStyle w:val="Hyperlink"/>
@@ -3861,7 +3826,7 @@
         </w:rPr>
         <w:t xml:space="preserve">,                    </w:t>
       </w:r>
-      <w:hyperlink r:id="rId37" w:history="1">
+      <w:hyperlink r:id="rId38" w:history="1">
         <w:r>
           <w:rPr>
             <w:rStyle w:val="Hyperlink"/>
@@ -3973,7 +3938,7 @@
           </mc:Choice>
           <mc:Fallback>
             <w:pict>
-              <v:shape w14:anchorId="6BDA47F5" id="Graphic 1" o:spid="_x0000_s1026" style="position:absolute;margin-left:46.8pt;margin-top:3.8pt;width:518.45pt;height:.1pt;z-index:-15713792;visibility:visible;mso-wrap-style:square;mso-wrap-distance-left:0;mso-wrap-distance-top:0;mso-wrap-distance-right:0;mso-wrap-distance-bottom:0;mso-position-horizontal:absolute;mso-position-horizontal-relative:page;mso-position-vertical:absolute;mso-position-vertical-relative:text;v-text-anchor:top" coordsize="6584315,1270" o:gfxdata="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" path="m,l6583692,e" filled="f" strokeweight=".14039mm">
+              <v:shape w14:anchorId="59CD9D66" id="Graphic 1" o:spid="_x0000_s1026" style="position:absolute;margin-left:46.8pt;margin-top:3.8pt;width:518.45pt;height:.1pt;z-index:-15713792;visibility:visible;mso-wrap-style:square;mso-wrap-distance-left:0;mso-wrap-distance-top:0;mso-wrap-distance-right:0;mso-wrap-distance-bottom:0;mso-position-horizontal:absolute;mso-position-horizontal-relative:page;mso-position-vertical:absolute;mso-position-vertical-relative:text;v-text-anchor:top" coordsize="6584315,1270" o:gfxdata="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" path="m,l6583692,e" filled="f" strokeweight=".14039mm">
                 <v:path arrowok="t"/>
                 <w10:wrap type="topAndBottom" anchorx="page"/>
               </v:shape>

</xml_diff>

<commit_message>
publications added and CV updated
</commit_message>
<xml_diff>
--- a/Files/CV_OLID_HASAN_BHUIYAN.docx
+++ b/Files/CV_OLID_HASAN_BHUIYAN.docx
@@ -338,7 +338,7 @@
           </mc:Choice>
           <mc:Fallback>
             <w:pict>
-              <v:shape w14:anchorId="574F6DB4" id="Graphic 1" o:spid="_x0000_s1026" style="position:absolute;margin-left:46.8pt;margin-top:3.8pt;width:518.45pt;height:.1pt;z-index:-15728640;visibility:visible;mso-wrap-style:square;mso-wrap-distance-left:0;mso-wrap-distance-top:0;mso-wrap-distance-right:0;mso-wrap-distance-bottom:0;mso-position-horizontal:absolute;mso-position-horizontal-relative:page;mso-position-vertical:absolute;mso-position-vertical-relative:text;v-text-anchor:top" coordsize="6584315,1270" o:gfxdata="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" path="m,l6583692,e" filled="f" strokeweight=".14039mm">
+              <v:shape w14:anchorId="53859146" id="Graphic 1" o:spid="_x0000_s1026" style="position:absolute;margin-left:46.8pt;margin-top:3.8pt;width:518.45pt;height:.1pt;z-index:-15728640;visibility:visible;mso-wrap-style:square;mso-wrap-distance-left:0;mso-wrap-distance-top:0;mso-wrap-distance-right:0;mso-wrap-distance-bottom:0;mso-position-horizontal:absolute;mso-position-horizontal-relative:page;mso-position-vertical:absolute;mso-position-vertical-relative:text;v-text-anchor:top" coordsize="6584315,1270" o:gfxdata="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" path="m,l6583692,e" filled="f" strokeweight=".14039mm">
                 <v:path arrowok="t"/>
                 <w10:wrap type="topAndBottom" anchorx="page"/>
               </v:shape>
@@ -1095,7 +1095,7 @@
           </mc:Choice>
           <mc:Fallback>
             <w:pict>
-              <v:shape w14:anchorId="5E59A5AA" id="Graphic 2" o:spid="_x0000_s1026" style="position:absolute;margin-left:46.8pt;margin-top:3.8pt;width:518.45pt;height:.1pt;z-index:-15728128;visibility:visible;mso-wrap-style:square;mso-wrap-distance-left:0;mso-wrap-distance-top:0;mso-wrap-distance-right:0;mso-wrap-distance-bottom:0;mso-position-horizontal:absolute;mso-position-horizontal-relative:page;mso-position-vertical:absolute;mso-position-vertical-relative:text;v-text-anchor:top" coordsize="6584315,1270" o:gfxdata="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" path="m,l6583692,e" filled="f" strokeweight=".14039mm">
+              <v:shape w14:anchorId="19EFDCAC" id="Graphic 2" o:spid="_x0000_s1026" style="position:absolute;margin-left:46.8pt;margin-top:3.8pt;width:518.45pt;height:.1pt;z-index:-15728128;visibility:visible;mso-wrap-style:square;mso-wrap-distance-left:0;mso-wrap-distance-top:0;mso-wrap-distance-right:0;mso-wrap-distance-bottom:0;mso-position-horizontal:absolute;mso-position-horizontal-relative:page;mso-position-vertical:absolute;mso-position-vertical-relative:text;v-text-anchor:top" coordsize="6584315,1270" o:gfxdata="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" path="m,l6583692,e" filled="f" strokeweight=".14039mm">
                 <v:path arrowok="t"/>
                 <w10:wrap type="topAndBottom" anchorx="page"/>
               </v:shape>
@@ -1190,539 +1190,10 @@
     </w:p>
     <w:p>
       <w:pPr>
-        <w:pStyle w:val="BodyText"/>
-        <w:spacing w:before="2"/>
-        <w:ind w:left="543"/>
-        <w:jc w:val="both"/>
-        <w:rPr>
-          <w:spacing w:val="25"/>
-        </w:rPr>
-      </w:pPr>
-      <w:r>
-        <w:rPr>
-          <w:b/>
-          <w:spacing w:val="-2"/>
-        </w:rPr>
-        <w:t>Synthetic Data Generator</w:t>
-      </w:r>
-      <w:r>
-        <w:rPr>
-          <w:spacing w:val="-2"/>
-        </w:rPr>
-        <w:t>:</w:t>
-      </w:r>
-      <w:r>
-        <w:rPr>
-          <w:spacing w:val="25"/>
-        </w:rPr>
-        <w:t xml:space="preserve"> Balancing utility and privacy of synthetic data generator.</w:t>
-      </w:r>
-    </w:p>
-    <w:p>
-      <w:pPr>
-        <w:pStyle w:val="BodyText"/>
-        <w:spacing w:before="2"/>
-        <w:ind w:left="543"/>
-        <w:jc w:val="both"/>
-      </w:pPr>
-      <w:r>
-        <w:rPr>
-          <w:b/>
-          <w:spacing w:val="-2"/>
-        </w:rPr>
-        <w:t>Cloud Security</w:t>
-      </w:r>
-      <w:r>
-        <w:t>:</w:t>
-      </w:r>
-      <w:r>
-        <w:t xml:space="preserve"> Security concerns of cloud systems like docker container.</w:t>
-      </w:r>
-    </w:p>
-    <w:p>
-      <w:pPr>
-        <w:pStyle w:val="BodyText"/>
-        <w:spacing w:before="21"/>
-        <w:ind w:left="543"/>
-        <w:jc w:val="both"/>
-        <w:rPr>
-          <w:spacing w:val="-2"/>
-        </w:rPr>
-      </w:pPr>
-      <w:r>
-        <w:rPr>
-          <w:b/>
-          <w:spacing w:val="-2"/>
-        </w:rPr>
-        <w:t>Computer Vision</w:t>
-      </w:r>
-      <w:r>
-        <w:rPr>
-          <w:spacing w:val="-2"/>
-        </w:rPr>
-        <w:t>:</w:t>
-      </w:r>
-      <w:r>
-        <w:rPr>
-          <w:spacing w:val="-4"/>
-        </w:rPr>
-        <w:t xml:space="preserve"> </w:t>
-      </w:r>
-      <w:r>
-        <w:rPr>
-          <w:spacing w:val="-2"/>
-        </w:rPr>
-        <w:t>Developing machine learning models for early diseases detection using u</w:t>
-      </w:r>
-      <w:r>
-        <w:rPr>
-          <w:spacing w:val="-2"/>
-        </w:rPr>
-        <w:t xml:space="preserve">biquitous </w:t>
-      </w:r>
-    </w:p>
-    <w:p>
-      <w:pPr>
-        <w:pStyle w:val="BodyText"/>
-        <w:spacing w:before="21"/>
-        <w:ind w:left="543"/>
-        <w:jc w:val="both"/>
-      </w:pPr>
-      <w:r>
-        <w:rPr>
-          <w:spacing w:val="-2"/>
-        </w:rPr>
-        <w:t>C</w:t>
-      </w:r>
-      <w:r>
-        <w:rPr>
-          <w:spacing w:val="-2"/>
-        </w:rPr>
-        <w:t>omputing</w:t>
-      </w:r>
-      <w:r>
-        <w:rPr>
-          <w:spacing w:val="-2"/>
-        </w:rPr>
-        <w:t>.</w:t>
-      </w:r>
-    </w:p>
-    <w:p>
-      <w:pPr>
-        <w:pStyle w:val="BodyText"/>
-        <w:spacing w:before="21" w:line="259" w:lineRule="auto"/>
-        <w:ind w:left="543" w:right="723"/>
-        <w:jc w:val="both"/>
-      </w:pPr>
-      <w:r>
-        <w:rPr>
-          <w:b/>
-          <w:spacing w:val="-2"/>
-        </w:rPr>
-        <w:t>Additional</w:t>
-      </w:r>
-      <w:r>
-        <w:rPr>
-          <w:spacing w:val="-2"/>
-        </w:rPr>
-        <w:t>:</w:t>
-      </w:r>
-      <w:r>
-        <w:rPr>
-          <w:spacing w:val="29"/>
-        </w:rPr>
-        <w:t xml:space="preserve"> </w:t>
-      </w:r>
-      <w:r>
-        <w:rPr>
-          <w:spacing w:val="-2"/>
-        </w:rPr>
-        <w:t>Data Structures</w:t>
-      </w:r>
-      <w:r>
-        <w:t xml:space="preserve"> </w:t>
-      </w:r>
-      <w:r>
-        <w:rPr>
-          <w:spacing w:val="-2"/>
-        </w:rPr>
-        <w:t>and Algorithms,</w:t>
-      </w:r>
-      <w:r>
-        <w:t xml:space="preserve"> </w:t>
-      </w:r>
-      <w:r>
-        <w:rPr>
-          <w:spacing w:val="-2"/>
-        </w:rPr>
-        <w:t xml:space="preserve">Security event prediction. </w:t>
-      </w:r>
-    </w:p>
-    <w:p>
-      <w:pPr>
-        <w:pStyle w:val="BodyText"/>
-        <w:spacing w:before="7"/>
-        <w:ind w:left="0"/>
-        <w:jc w:val="both"/>
-      </w:pPr>
-    </w:p>
-    <w:p>
-      <w:pPr>
-        <w:rPr>
-          <w:color w:val="EE0000"/>
-        </w:rPr>
-      </w:pPr>
-      <w:r>
-        <w:rPr>
-          <w:w w:val="105"/>
-        </w:rPr>
-        <w:t xml:space="preserve">       </w:t>
-      </w:r>
-      <w:r>
-        <w:rPr>
-          <w:color w:val="EE0000"/>
-          <w:w w:val="105"/>
-        </w:rPr>
-        <w:t>RESEARCH E</w:t>
-      </w:r>
-      <w:r>
-        <w:rPr>
-          <w:color w:val="EE0000"/>
-          <w:w w:val="105"/>
-        </w:rPr>
-        <w:t>XPERIENCE</w:t>
-      </w:r>
-    </w:p>
-    <w:p>
-      <w:pPr>
-        <w:pStyle w:val="BodyText"/>
-        <w:spacing w:before="6"/>
-        <w:ind w:left="0"/>
-        <w:jc w:val="both"/>
-        <w:rPr>
-          <w:sz w:val="4"/>
-        </w:rPr>
-      </w:pPr>
-      <w:r>
-        <w:rPr>
-          <w:noProof/>
-          <w:sz w:val="4"/>
-        </w:rPr>
-        <mc:AlternateContent>
-          <mc:Choice Requires="wps">
-            <w:drawing>
-              <wp:anchor distT="0" distB="0" distL="0" distR="0" simplePos="0" relativeHeight="487594496" behindDoc="1" locked="0" layoutInCell="1" allowOverlap="1" wp14:anchorId="41300DDC" wp14:editId="6B90910D">
-                <wp:simplePos x="0" y="0"/>
-                <wp:positionH relativeFrom="page">
-                  <wp:posOffset>594359</wp:posOffset>
-                </wp:positionH>
-                <wp:positionV relativeFrom="paragraph">
-                  <wp:posOffset>48036</wp:posOffset>
-                </wp:positionV>
-                <wp:extent cx="6584315" cy="1270"/>
-                <wp:effectExtent l="0" t="0" r="0" b="0"/>
-                <wp:wrapTopAndBottom/>
-                <wp:docPr id="1347002725" name="Graphic 2"/>
-                <wp:cNvGraphicFramePr>
-                  <a:graphicFrameLocks xmlns:a="http://schemas.openxmlformats.org/drawingml/2006/main"/>
-                </wp:cNvGraphicFramePr>
-                <a:graphic xmlns:a="http://schemas.openxmlformats.org/drawingml/2006/main">
-                  <a:graphicData uri="http://schemas.microsoft.com/office/word/2010/wordprocessingShape">
-                    <wps:wsp>
-                      <wps:cNvSpPr>
-                        <a:spLocks/>
-                      </wps:cNvSpPr>
-                      <wps:spPr>
-                        <a:xfrm>
-                          <a:off x="0" y="0"/>
-                          <a:ext cx="6584315" cy="1270"/>
-                        </a:xfrm>
-                        <a:custGeom>
-                          <a:avLst/>
-                          <a:gdLst/>
-                          <a:ahLst/>
-                          <a:cxnLst/>
-                          <a:rect l="l" t="t" r="r" b="b"/>
-                          <a:pathLst>
-                            <a:path w="6584315">
-                              <a:moveTo>
-                                <a:pt x="0" y="0"/>
-                              </a:moveTo>
-                              <a:lnTo>
-                                <a:pt x="6583692" y="0"/>
-                              </a:lnTo>
-                            </a:path>
-                          </a:pathLst>
-                        </a:custGeom>
-                        <a:ln w="5054">
-                          <a:solidFill>
-                            <a:srgbClr val="000000"/>
-                          </a:solidFill>
-                          <a:prstDash val="solid"/>
-                        </a:ln>
-                      </wps:spPr>
-                      <wps:bodyPr wrap="square" lIns="0" tIns="0" rIns="0" bIns="0" rtlCol="0">
-                        <a:prstTxWarp prst="textNoShape">
-                          <a:avLst/>
-                        </a:prstTxWarp>
-                        <a:noAutofit/>
-                      </wps:bodyPr>
-                    </wps:wsp>
-                  </a:graphicData>
-                </a:graphic>
-              </wp:anchor>
-            </w:drawing>
-          </mc:Choice>
-          <mc:Fallback>
-            <w:pict>
-              <v:shape w14:anchorId="2CDE9499" id="Graphic 2" o:spid="_x0000_s1026" style="position:absolute;margin-left:46.8pt;margin-top:3.8pt;width:518.45pt;height:.1pt;z-index:-15721984;visibility:visible;mso-wrap-style:square;mso-wrap-distance-left:0;mso-wrap-distance-top:0;mso-wrap-distance-right:0;mso-wrap-distance-bottom:0;mso-position-horizontal:absolute;mso-position-horizontal-relative:page;mso-position-vertical:absolute;mso-position-vertical-relative:text;v-text-anchor:top" coordsize="6584315,1270" o:gfxdata="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" path="m,l6583692,e" filled="f" strokeweight=".14039mm">
-                <v:path arrowok="t"/>
-                <w10:wrap type="topAndBottom" anchorx="page"/>
-              </v:shape>
-            </w:pict>
-          </mc:Fallback>
-        </mc:AlternateContent>
-      </w:r>
-    </w:p>
-    <w:p>
-      <w:pPr>
-        <w:pStyle w:val="Heading1"/>
-        <w:spacing w:before="245"/>
-        <w:jc w:val="both"/>
-      </w:pPr>
-      <w:r>
-        <w:rPr>
-          <w:w w:val="105"/>
-        </w:rPr>
-        <w:t>Cloud Security</w:t>
-      </w:r>
-    </w:p>
-    <w:p>
-      <w:pPr>
         <w:pStyle w:val="ListParagraph"/>
         <w:numPr>
           <w:ilvl w:val="0"/>
-          <w:numId w:val="1"/>
-        </w:numPr>
-        <w:tabs>
-          <w:tab w:val="left" w:pos="1021"/>
-          <w:tab w:val="left" w:pos="1023"/>
-        </w:tabs>
-        <w:spacing w:before="139" w:line="249" w:lineRule="auto"/>
-        <w:ind w:right="933"/>
-        <w:jc w:val="both"/>
-      </w:pPr>
-      <w:r>
-        <w:rPr>
-          <w:spacing w:val="-2"/>
-        </w:rPr>
-        <w:t>On Detecting Malicious Code Injection By Monitoring Multi-level Container Act</w:t>
-      </w:r>
-      <w:r>
-        <w:rPr>
-          <w:spacing w:val="-2"/>
-        </w:rPr>
-        <w:t xml:space="preserve">ivities. </w:t>
-      </w:r>
-      <w:hyperlink r:id="rId10" w:history="1">
-        <w:r>
-          <w:rPr>
-            <w:rStyle w:val="Hyperlink"/>
-            <w:spacing w:val="-2"/>
-          </w:rPr>
-          <w:t>[CLOSER 2024</w:t>
-        </w:r>
-        <w:r>
-          <w:rPr>
-            <w:rStyle w:val="Hyperlink"/>
-            <w:spacing w:val="-2"/>
-          </w:rPr>
-          <w:t>]</w:t>
-        </w:r>
-      </w:hyperlink>
-      <w:r>
-        <w:rPr>
-          <w:spacing w:val="-2"/>
-        </w:rPr>
-        <w:t xml:space="preserve"> </w:t>
-      </w:r>
-      <w:hyperlink r:id="rId11" w:history="1">
-        <w:r>
-          <w:rPr>
-            <w:rStyle w:val="Hyperlink"/>
-            <w:spacing w:val="-2"/>
-          </w:rPr>
-          <w:t>[Paper]</w:t>
-        </w:r>
-      </w:hyperlink>
-      <w:r>
-        <w:rPr>
-          <w:spacing w:val="-2"/>
-        </w:rPr>
-        <w:t xml:space="preserve"> </w:t>
-      </w:r>
-      <w:hyperlink r:id="rId12" w:history="1">
-        <w:r>
-          <w:rPr>
-            <w:rStyle w:val="Hyperlink"/>
-            <w:spacing w:val="-2"/>
-          </w:rPr>
-          <w:t>[Code]</w:t>
-        </w:r>
-      </w:hyperlink>
-    </w:p>
-    <w:p>
-      <w:pPr>
-        <w:pStyle w:val="BodyText"/>
-        <w:numPr>
-          <w:ilvl w:val="0"/>
-          <w:numId w:val="5"/>
-        </w:numPr>
-        <w:spacing w:before="11"/>
-        <w:jc w:val="both"/>
-      </w:pPr>
-      <w:r>
-        <w:t>Sk</w:t>
-      </w:r>
-      <w:r>
-        <w:t>ills:</w:t>
-      </w:r>
-      <w:r>
-        <w:rPr>
-          <w:spacing w:val="31"/>
-        </w:rPr>
-        <w:t xml:space="preserve"> </w:t>
-      </w:r>
-      <w:r>
-        <w:t>Container Security, Malicious Code Injection, Kubernetes, Multi-Level Monitoring</w:t>
-      </w:r>
-    </w:p>
-    <w:p>
-      <w:pPr>
-        <w:pStyle w:val="Heading1"/>
-        <w:jc w:val="both"/>
-      </w:pPr>
-      <w:r>
-        <w:rPr>
-          <w:w w:val="105"/>
-        </w:rPr>
-        <w:t>Computer Vision</w:t>
-      </w:r>
-    </w:p>
-    <w:p>
-      <w:pPr>
-        <w:pStyle w:val="ListParagraph"/>
-        <w:numPr>
-          <w:ilvl w:val="0"/>
-          <w:numId w:val="1"/>
-        </w:numPr>
-        <w:tabs>
-          <w:tab w:val="left" w:pos="1021"/>
-          <w:tab w:val="left" w:pos="1023"/>
-        </w:tabs>
-        <w:spacing w:before="149" w:line="249" w:lineRule="auto"/>
-        <w:ind w:right="934"/>
-        <w:jc w:val="both"/>
-      </w:pPr>
-      <w:r>
-        <w:t>H2OPulse: Smartphone-assisted Vein Evaluation for Early Recognition of Dehydration</w:t>
-      </w:r>
-      <w:r>
-        <w:t xml:space="preserve">. </w:t>
-      </w:r>
-      <w:hyperlink r:id="rId13" w:history="1">
-        <w:r>
-          <w:rPr>
-            <w:rStyle w:val="Hyperlink"/>
-          </w:rPr>
-          <w:t>[IMWUT Nov 2024</w:t>
-        </w:r>
-        <w:r>
-          <w:rPr>
-            <w:rStyle w:val="Hyperlink"/>
-          </w:rPr>
-          <w:t>]</w:t>
-        </w:r>
-      </w:hyperlink>
-      <w:r>
-        <w:t xml:space="preserve"> </w:t>
-      </w:r>
-      <w:hyperlink r:id="rId14" w:history="1">
-        <w:r>
-          <w:rPr>
-            <w:rStyle w:val="Hyperlink"/>
-          </w:rPr>
-          <w:t>[Paper]</w:t>
-        </w:r>
-      </w:hyperlink>
-      <w:r>
-        <w:t xml:space="preserve"> </w:t>
-      </w:r>
-      <w:hyperlink r:id="rId15" w:history="1">
-        <w:r>
-          <w:rPr>
-            <w:rStyle w:val="Hyperlink"/>
-          </w:rPr>
-          <w:t>[Code]</w:t>
-        </w:r>
-      </w:hyperlink>
-    </w:p>
-    <w:p>
-      <w:pPr>
-        <w:pStyle w:val="BodyText"/>
-        <w:numPr>
-          <w:ilvl w:val="0"/>
-          <w:numId w:val="5"/>
-        </w:numPr>
-        <w:spacing w:before="11"/>
-        <w:jc w:val="both"/>
-      </w:pPr>
-      <w:r>
-        <w:t>Skills:</w:t>
-      </w:r>
-      <w:r>
-        <w:rPr>
-          <w:spacing w:val="19"/>
-        </w:rPr>
-        <w:t xml:space="preserve"> </w:t>
-      </w:r>
-      <w:r>
-        <w:t>M</w:t>
-      </w:r>
-      <w:r>
-        <w:t xml:space="preserve">obile health, </w:t>
-      </w:r>
-      <w:r>
-        <w:t>I</w:t>
-      </w:r>
-      <w:r>
-        <w:t>mage processing, Siamese</w:t>
-      </w:r>
-      <w:r>
-        <w:t xml:space="preserve"> neural</w:t>
-      </w:r>
-      <w:r>
-        <w:t xml:space="preserve"> network</w:t>
-      </w:r>
-    </w:p>
-    <w:p>
-      <w:pPr>
-        <w:pStyle w:val="Heading1"/>
-        <w:jc w:val="both"/>
-      </w:pPr>
-      <w:r>
-        <w:rPr>
-          <w:w w:val="105"/>
-        </w:rPr>
-        <w:t>Privacy In Federated Learning</w:t>
-      </w:r>
-    </w:p>
-    <w:p>
-      <w:pPr>
-        <w:pStyle w:val="ListParagraph"/>
-        <w:numPr>
-          <w:ilvl w:val="0"/>
-          <w:numId w:val="4"/>
+          <w:numId w:val="13"/>
         </w:numPr>
         <w:tabs>
           <w:tab w:val="left" w:pos="1021"/>
@@ -1731,12 +1202,63 @@
         <w:spacing w:before="10" w:line="249" w:lineRule="auto"/>
         <w:ind w:right="935"/>
         <w:jc w:val="both"/>
-      </w:pPr>
-      <w:r>
-        <w:rPr>
-          <w:spacing w:val="-2"/>
-        </w:rPr>
-        <w:t>Auditing Empirical Privacy in Vertical Federated learning framework.</w:t>
+        <w:rPr>
+          <w:spacing w:val="-4"/>
+        </w:rPr>
+      </w:pPr>
+      <w:r>
+        <w:rPr>
+          <w:spacing w:val="-4"/>
+        </w:rPr>
+        <w:t xml:space="preserve">     </w:t>
+      </w:r>
+      <w:r>
+        <w:rPr>
+          <w:spacing w:val="-4"/>
+        </w:rPr>
+        <w:t>Skills:</w:t>
+      </w:r>
+      <w:r>
+        <w:rPr>
+          <w:spacing w:val="22"/>
+        </w:rPr>
+        <w:t xml:space="preserve"> </w:t>
+      </w:r>
+      <w:r>
+        <w:rPr>
+          <w:spacing w:val="-4"/>
+        </w:rPr>
+        <w:t>Differential Privacy, Federated Learning, Membership Inference Attack, Feature Inference Attack.</w:t>
+      </w:r>
+    </w:p>
+    <w:p>
+      <w:pPr>
+        <w:pStyle w:val="BodyText"/>
+        <w:spacing w:before="2"/>
+        <w:ind w:left="543"/>
+        <w:jc w:val="both"/>
+        <w:rPr>
+          <w:spacing w:val="25"/>
+        </w:rPr>
+      </w:pPr>
+      <w:r>
+        <w:rPr>
+          <w:b/>
+          <w:spacing w:val="-2"/>
+        </w:rPr>
+        <w:t>Synthetic Data Generator</w:t>
+      </w:r>
+      <w:r>
+        <w:rPr>
+          <w:spacing w:val="-2"/>
+        </w:rPr>
+        <w:t>:</w:t>
+      </w:r>
+      <w:r>
+        <w:rPr>
+          <w:spacing w:val="25"/>
+        </w:rPr>
+        <w:t xml:space="preserve"> Balancing utility and privacy of synthetic data generator.</w:t>
       </w:r>
     </w:p>
     <w:p>
@@ -1744,7 +1266,7 @@
         <w:pStyle w:val="ListParagraph"/>
         <w:numPr>
           <w:ilvl w:val="0"/>
-          <w:numId w:val="5"/>
+          <w:numId w:val="13"/>
         </w:numPr>
         <w:tabs>
           <w:tab w:val="left" w:pos="1021"/>
@@ -1761,6 +1283,12 @@
         <w:rPr>
           <w:spacing w:val="-4"/>
         </w:rPr>
+        <w:t xml:space="preserve">     </w:t>
+      </w:r>
+      <w:r>
+        <w:rPr>
+          <w:spacing w:val="-4"/>
+        </w:rPr>
         <w:t>Skills:</w:t>
       </w:r>
       <w:r>
@@ -1773,173 +1301,169 @@
         <w:rPr>
           <w:spacing w:val="-4"/>
         </w:rPr>
-        <w:t>Differential Privacy, Federated Learning, Membership Inference Attack, Feature Inference Attack.</w:t>
-      </w:r>
-    </w:p>
-    <w:p>
-      <w:pPr>
-        <w:pStyle w:val="Heading1"/>
+        <w:t>Differential Privacy, Membership Inference Attack</w:t>
+      </w:r>
+      <w:r>
+        <w:rPr>
+          <w:spacing w:val="-4"/>
+        </w:rPr>
+        <w:t>, Property Inference Attack</w:t>
+      </w:r>
+    </w:p>
+    <w:p>
+      <w:pPr>
+        <w:pStyle w:val="BodyText"/>
+        <w:spacing w:before="2"/>
+        <w:ind w:left="543"/>
         <w:jc w:val="both"/>
       </w:pPr>
       <w:r>
         <w:rPr>
-          <w:w w:val="105"/>
-        </w:rPr>
-        <w:t>Synthetic Time Series Generator</w:t>
-      </w:r>
-    </w:p>
-    <w:p>
-      <w:pPr>
-        <w:pStyle w:val="ListParagraph"/>
+          <w:b/>
+          <w:spacing w:val="-2"/>
+        </w:rPr>
+        <w:t>Cloud Security</w:t>
+      </w:r>
+      <w:r>
+        <w:t>:</w:t>
+      </w:r>
+      <w:r>
+        <w:t xml:space="preserve"> Security concerns of cloud systems like docker container.</w:t>
+      </w:r>
+    </w:p>
+    <w:p>
+      <w:pPr>
+        <w:pStyle w:val="BodyText"/>
         <w:numPr>
           <w:ilvl w:val="0"/>
-          <w:numId w:val="4"/>
+          <w:numId w:val="13"/>
         </w:numPr>
-        <w:tabs>
-          <w:tab w:val="left" w:pos="1021"/>
-          <w:tab w:val="left" w:pos="1023"/>
-        </w:tabs>
-        <w:spacing w:before="10" w:line="249" w:lineRule="auto"/>
-        <w:ind w:right="935"/>
+        <w:spacing w:before="11"/>
         <w:jc w:val="both"/>
       </w:pPr>
       <w:r>
-        <w:rPr>
-          <w:spacing w:val="-2"/>
-        </w:rPr>
-        <w:t>Utility and Privacy analysis of synthetic time series generator</w:t>
-      </w:r>
-    </w:p>
-    <w:p>
-      <w:pPr>
-        <w:pStyle w:val="ListParagraph"/>
+        <w:t>Sk</w:t>
+      </w:r>
+      <w:r>
+        <w:t>ills:</w:t>
+      </w:r>
+      <w:r>
+        <w:rPr>
+          <w:spacing w:val="31"/>
+        </w:rPr>
+        <w:t xml:space="preserve"> </w:t>
+      </w:r>
+      <w:r>
+        <w:t>Container Security, Malicious Code Injection, Kubernetes, Multi-Level Monitoring</w:t>
+      </w:r>
+    </w:p>
+    <w:p>
+      <w:pPr>
+        <w:pStyle w:val="BodyText"/>
+        <w:spacing w:before="21"/>
+        <w:ind w:left="543"/>
+        <w:jc w:val="both"/>
+        <w:rPr>
+          <w:spacing w:val="-2"/>
+        </w:rPr>
+      </w:pPr>
+      <w:r>
+        <w:rPr>
+          <w:b/>
+          <w:spacing w:val="-2"/>
+        </w:rPr>
+        <w:t>Computer Vision</w:t>
+      </w:r>
+      <w:r>
+        <w:rPr>
+          <w:spacing w:val="-2"/>
+        </w:rPr>
+        <w:t>:</w:t>
+      </w:r>
+      <w:r>
+        <w:rPr>
+          <w:spacing w:val="-4"/>
+        </w:rPr>
+        <w:t xml:space="preserve"> </w:t>
+      </w:r>
+      <w:r>
+        <w:rPr>
+          <w:spacing w:val="-2"/>
+        </w:rPr>
+        <w:t>Developing machine learning models for early diseases detection using u</w:t>
+      </w:r>
+      <w:r>
+        <w:rPr>
+          <w:spacing w:val="-2"/>
+        </w:rPr>
+        <w:t xml:space="preserve">biquitous </w:t>
+      </w:r>
+    </w:p>
+    <w:p>
+      <w:pPr>
+        <w:pStyle w:val="BodyText"/>
+        <w:spacing w:before="21"/>
+        <w:ind w:left="543"/>
+        <w:jc w:val="both"/>
+        <w:rPr>
+          <w:spacing w:val="-2"/>
+        </w:rPr>
+      </w:pPr>
+      <w:r>
+        <w:rPr>
+          <w:spacing w:val="-2"/>
+        </w:rPr>
+        <w:t>C</w:t>
+      </w:r>
+      <w:r>
+        <w:rPr>
+          <w:spacing w:val="-2"/>
+        </w:rPr>
+        <w:t>omputing</w:t>
+      </w:r>
+      <w:r>
+        <w:rPr>
+          <w:spacing w:val="-2"/>
+        </w:rPr>
+        <w:t>.</w:t>
+      </w:r>
+    </w:p>
+    <w:p>
+      <w:pPr>
+        <w:pStyle w:val="BodyText"/>
         <w:numPr>
           <w:ilvl w:val="0"/>
-          <w:numId w:val="5"/>
+          <w:numId w:val="13"/>
         </w:numPr>
-        <w:tabs>
-          <w:tab w:val="left" w:pos="1021"/>
-          <w:tab w:val="left" w:pos="1023"/>
-        </w:tabs>
-        <w:spacing w:before="10" w:line="249" w:lineRule="auto"/>
-        <w:ind w:right="935"/>
+        <w:spacing w:before="11"/>
         <w:jc w:val="both"/>
-        <w:rPr>
-          <w:spacing w:val="-4"/>
-        </w:rPr>
-      </w:pPr>
-      <w:r>
-        <w:rPr>
-          <w:spacing w:val="-4"/>
-        </w:rPr>
+      </w:pPr>
+      <w:r>
         <w:t>Skills:</w:t>
       </w:r>
       <w:r>
         <w:rPr>
-          <w:spacing w:val="22"/>
+          <w:spacing w:val="19"/>
         </w:rPr>
         <w:t xml:space="preserve"> </w:t>
       </w:r>
       <w:r>
-        <w:rPr>
-          <w:spacing w:val="-4"/>
-        </w:rPr>
-        <w:t>Differential Privacy, Membership Inference Attack.</w:t>
-      </w:r>
-    </w:p>
-    <w:p>
-      <w:pPr>
-        <w:pStyle w:val="Heading1"/>
-        <w:jc w:val="both"/>
-      </w:pPr>
-      <w:r>
-        <w:rPr>
-          <w:w w:val="105"/>
-        </w:rPr>
-        <w:t>File System Vulnerability in OS</w:t>
-      </w:r>
-    </w:p>
-    <w:p>
-      <w:pPr>
-        <w:pStyle w:val="ListParagraph"/>
-        <w:numPr>
-          <w:ilvl w:val="0"/>
-          <w:numId w:val="4"/>
-        </w:numPr>
-        <w:tabs>
-          <w:tab w:val="left" w:pos="1021"/>
-          <w:tab w:val="left" w:pos="1023"/>
-        </w:tabs>
-        <w:spacing w:before="10" w:line="249" w:lineRule="auto"/>
-        <w:ind w:right="935"/>
-        <w:jc w:val="both"/>
-      </w:pPr>
-      <w:r>
-        <w:rPr>
-          <w:spacing w:val="-2"/>
-        </w:rPr>
-        <w:t xml:space="preserve">Mitigating Git File System Vulnerability </w:t>
-      </w:r>
-      <w:hyperlink r:id="rId16" w:history="1">
-        <w:r>
-          <w:rPr>
-            <w:rStyle w:val="Hyperlink"/>
-            <w:spacing w:val="-2"/>
-          </w:rPr>
-          <w:t>[Report]</w:t>
-        </w:r>
-      </w:hyperlink>
-      <w:r>
-        <w:rPr>
-          <w:spacing w:val="-2"/>
-        </w:rPr>
-        <w:t xml:space="preserve"> </w:t>
-      </w:r>
-      <w:hyperlink r:id="rId17" w:history="1">
-        <w:r>
-          <w:rPr>
-            <w:rStyle w:val="Hyperlink"/>
-            <w:spacing w:val="-2"/>
-          </w:rPr>
-          <w:t>[Code]</w:t>
-        </w:r>
-      </w:hyperlink>
-    </w:p>
-    <w:p>
-      <w:pPr>
-        <w:pStyle w:val="ListParagraph"/>
-        <w:numPr>
-          <w:ilvl w:val="0"/>
-          <w:numId w:val="5"/>
-        </w:numPr>
-        <w:tabs>
-          <w:tab w:val="left" w:pos="1021"/>
-          <w:tab w:val="left" w:pos="1023"/>
-        </w:tabs>
-        <w:spacing w:before="10" w:line="249" w:lineRule="auto"/>
-        <w:ind w:right="935"/>
-        <w:jc w:val="both"/>
-        <w:rPr>
-          <w:spacing w:val="-4"/>
-        </w:rPr>
-      </w:pPr>
-      <w:r>
-        <w:rPr>
-          <w:spacing w:val="-4"/>
-        </w:rPr>
-        <w:t>Skills:</w:t>
-      </w:r>
-      <w:r>
-        <w:rPr>
-          <w:spacing w:val="22"/>
-        </w:rPr>
-        <w:t xml:space="preserve"> </w:t>
-      </w:r>
-      <w:r>
-        <w:rPr>
-          <w:spacing w:val="-4"/>
-        </w:rPr>
-        <w:t>CVE, Git, eBPF.</w:t>
+        <w:t>M</w:t>
+      </w:r>
+      <w:r>
+        <w:t xml:space="preserve">obile health, </w:t>
+      </w:r>
+      <w:r>
+        <w:t>I</w:t>
+      </w:r>
+      <w:r>
+        <w:t>mage processing, Siamese</w:t>
+      </w:r>
+      <w:r>
+        <w:t xml:space="preserve"> neural</w:t>
+      </w:r>
+      <w:r>
+        <w:t xml:space="preserve"> network</w:t>
       </w:r>
     </w:p>
     <w:p>
@@ -2061,7 +1585,7 @@
           </mc:Choice>
           <mc:Fallback>
             <w:pict>
-              <v:shape w14:anchorId="4CF40520" id="Graphic 1" o:spid="_x0000_s1026" style="position:absolute;margin-left:46.8pt;margin-top:3.8pt;width:518.45pt;height:.1pt;z-index:-15711744;visibility:visible;mso-wrap-style:square;mso-wrap-distance-left:0;mso-wrap-distance-top:0;mso-wrap-distance-right:0;mso-wrap-distance-bottom:0;mso-position-horizontal:absolute;mso-position-horizontal-relative:page;mso-position-vertical:absolute;mso-position-vertical-relative:text;v-text-anchor:top" coordsize="6584315,1270" o:gfxdata="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" path="m,l6583692,e" filled="f" strokeweight=".14039mm">
+              <v:shape w14:anchorId="2AEFF854" id="Graphic 1" o:spid="_x0000_s1026" style="position:absolute;margin-left:46.8pt;margin-top:3.8pt;width:518.45pt;height:.1pt;z-index:-15711744;visibility:visible;mso-wrap-style:square;mso-wrap-distance-left:0;mso-wrap-distance-top:0;mso-wrap-distance-right:0;mso-wrap-distance-bottom:0;mso-position-horizontal:absolute;mso-position-horizontal-relative:page;mso-position-vertical:absolute;mso-position-vertical-relative:text;v-text-anchor:top" coordsize="6584315,1270" o:gfxdata="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" path="m,l6583692,e" filled="f" strokeweight=".14039mm">
                 <v:path arrowok="t"/>
                 <w10:wrap type="topAndBottom" anchorx="page"/>
               </v:shape>
@@ -2089,7 +1613,7 @@
         </w:rPr>
         <w:t xml:space="preserve">Humanities and Social Sciences Communications </w:t>
       </w:r>
-      <w:hyperlink r:id="rId18" w:history="1">
+      <w:hyperlink r:id="rId10" w:history="1">
         <w:r>
           <w:rPr>
             <w:rStyle w:val="Hyperlink"/>
@@ -2104,7 +1628,7 @@
         </w:rPr>
         <w:t xml:space="preserve"> </w:t>
       </w:r>
-      <w:hyperlink r:id="rId19" w:history="1">
+      <w:hyperlink r:id="rId11" w:history="1">
         <w:r>
           <w:rPr>
             <w:rStyle w:val="Hyperlink"/>
@@ -2116,15 +1640,11 @@
     </w:p>
     <w:p>
       <w:pPr>
-        <w:tabs>
-          <w:tab w:val="left" w:pos="1021"/>
-          <w:tab w:val="left" w:pos="1023"/>
-        </w:tabs>
-        <w:spacing w:before="10" w:line="249" w:lineRule="auto"/>
-        <w:ind w:right="935"/>
         <w:jc w:val="both"/>
         <w:rPr>
-          <w:spacing w:val="-4"/>
+          <w:color w:val="C41230"/>
+          <w:spacing w:val="-2"/>
+          <w:w w:val="105"/>
         </w:rPr>
       </w:pPr>
     </w:p>
@@ -2139,8 +1659,7 @@
           <w:spacing w:val="-2"/>
           <w:w w:val="105"/>
         </w:rPr>
-        <w:lastRenderedPageBreak/>
-        <w:t xml:space="preserve">     </w:t>
+        <w:t xml:space="preserve">   </w:t>
       </w:r>
       <w:r>
         <w:rPr>
@@ -2241,7 +1760,7 @@
           </mc:Choice>
           <mc:Fallback>
             <w:pict>
-              <v:shape w14:anchorId="6ADA82CA" id="Graphic 3" o:spid="_x0000_s1026" style="position:absolute;margin-left:46.8pt;margin-top:3.8pt;width:518.45pt;height:.1pt;z-index:-15724032;visibility:visible;mso-wrap-style:square;mso-wrap-distance-left:0;mso-wrap-distance-top:0;mso-wrap-distance-right:0;mso-wrap-distance-bottom:0;mso-position-horizontal:absolute;mso-position-horizontal-relative:page;mso-position-vertical:absolute;mso-position-vertical-relative:text;v-text-anchor:top" coordsize="6584315,1270" o:gfxdata="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" path="m,l6583692,e" filled="f" strokeweight=".14039mm">
+              <v:shape w14:anchorId="6A8F3985" id="Graphic 3" o:spid="_x0000_s1026" style="position:absolute;margin-left:46.8pt;margin-top:3.8pt;width:518.45pt;height:.1pt;z-index:-15724032;visibility:visible;mso-wrap-style:square;mso-wrap-distance-left:0;mso-wrap-distance-top:0;mso-wrap-distance-right:0;mso-wrap-distance-bottom:0;mso-position-horizontal:absolute;mso-position-horizontal-relative:page;mso-position-vertical:absolute;mso-position-vertical-relative:text;v-text-anchor:top" coordsize="6584315,1270" o:gfxdata="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" path="m,l6583692,e" filled="f" strokeweight=".14039mm">
                 <v:path arrowok="t"/>
                 <w10:wrap type="topAndBottom" anchorx="page"/>
               </v:shape>
@@ -2582,7 +2101,7 @@
           </mc:Choice>
           <mc:Fallback>
             <w:pict>
-              <v:shape w14:anchorId="6698368C" id="Graphic 1" o:spid="_x0000_s1026" style="position:absolute;margin-left:46.8pt;margin-top:3.8pt;width:518.45pt;height:.1pt;z-index:-15717888;visibility:visible;mso-wrap-style:square;mso-wrap-distance-left:0;mso-wrap-distance-top:0;mso-wrap-distance-right:0;mso-wrap-distance-bottom:0;mso-position-horizontal:absolute;mso-position-horizontal-relative:page;mso-position-vertical:absolute;mso-position-vertical-relative:text;v-text-anchor:top" coordsize="6584315,1270" o:gfxdata="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" path="m,l6583692,e" filled="f" strokeweight=".14039mm">
+              <v:shape w14:anchorId="41B366DF" id="Graphic 1" o:spid="_x0000_s1026" style="position:absolute;margin-left:46.8pt;margin-top:3.8pt;width:518.45pt;height:.1pt;z-index:-15717888;visibility:visible;mso-wrap-style:square;mso-wrap-distance-left:0;mso-wrap-distance-top:0;mso-wrap-distance-right:0;mso-wrap-distance-bottom:0;mso-position-horizontal:absolute;mso-position-horizontal-relative:page;mso-position-vertical:absolute;mso-position-vertical-relative:text;v-text-anchor:top" coordsize="6584315,1270" o:gfxdata="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" path="m,l6583692,e" filled="f" strokeweight=".14039mm">
                 <v:path arrowok="t"/>
                 <w10:wrap type="topAndBottom" anchorx="page"/>
               </v:shape>
@@ -2704,7 +2223,7 @@
         </w:rPr>
         <w:t>CS 09B [</w:t>
       </w:r>
-      <w:hyperlink r:id="rId20" w:history="1">
+      <w:hyperlink r:id="rId12" w:history="1">
         <w:r>
           <w:rPr>
             <w:rStyle w:val="Hyperlink"/>
@@ -2745,7 +2264,7 @@
         </w:rPr>
         <w:t xml:space="preserve">CS 170 </w:t>
       </w:r>
-      <w:hyperlink r:id="rId21" w:history="1">
+      <w:hyperlink r:id="rId13" w:history="1">
         <w:r>
           <w:rPr>
             <w:rStyle w:val="Hyperlink"/>
@@ -2758,21 +2277,7 @@
             <w:rStyle w:val="Hyperlink"/>
             <w:spacing w:val="-2"/>
           </w:rPr>
-          <w:t>Introducti</w:t>
-        </w:r>
-        <w:r>
-          <w:rPr>
-            <w:rStyle w:val="Hyperlink"/>
-            <w:spacing w:val="-2"/>
-          </w:rPr>
-          <w:t>o</w:t>
-        </w:r>
-        <w:r>
-          <w:rPr>
-            <w:rStyle w:val="Hyperlink"/>
-            <w:spacing w:val="-2"/>
-          </w:rPr>
-          <w:t>n to Artificial Intelligence</w:t>
+          <w:t>Introduction to Artificial Intelligence</w:t>
         </w:r>
         <w:r>
           <w:rPr>
@@ -2785,7 +2290,7 @@
       <w:r>
         <w:t xml:space="preserve"> </w:t>
       </w:r>
-      <w:hyperlink r:id="rId22" w:history="1">
+      <w:hyperlink r:id="rId14" w:history="1">
         <w:r>
           <w:rPr>
             <w:rStyle w:val="Hyperlink"/>
@@ -2827,7 +2332,7 @@
         </w:rPr>
         <w:t xml:space="preserve">CS 163 </w:t>
       </w:r>
-      <w:hyperlink r:id="rId23" w:history="1">
+      <w:hyperlink r:id="rId15" w:history="1">
         <w:r>
           <w:rPr>
             <w:rStyle w:val="Hyperlink"/>
@@ -2842,7 +2347,7 @@
         </w:rPr>
         <w:t xml:space="preserve"> </w:t>
       </w:r>
-      <w:hyperlink r:id="rId24" w:history="1">
+      <w:hyperlink r:id="rId16" w:history="1">
         <w:r>
           <w:rPr>
             <w:rStyle w:val="Hyperlink"/>
@@ -2899,13 +2404,22 @@
         </w:rPr>
         <w:t xml:space="preserve">, </w:t>
       </w:r>
-      <w:hyperlink r:id="rId25" w:history="1">
+      <w:hyperlink r:id="rId17" w:history="1">
+        <w:proofErr w:type="spellStart"/>
         <w:r>
           <w:rPr>
             <w:rStyle w:val="Hyperlink"/>
             <w:spacing w:val="-2"/>
           </w:rPr>
-          <w:t>Relisource Software Ltd</w:t>
+          <w:t>Relisource</w:t>
+        </w:r>
+        <w:proofErr w:type="spellEnd"/>
+        <w:r>
+          <w:rPr>
+            <w:rStyle w:val="Hyperlink"/>
+            <w:spacing w:val="-2"/>
+          </w:rPr>
+          <w:t xml:space="preserve"> Software Ltd</w:t>
         </w:r>
       </w:hyperlink>
       <w:r>
@@ -2942,6 +2456,7 @@
           <w:bCs/>
           <w:spacing w:val="-2"/>
         </w:rPr>
+        <w:lastRenderedPageBreak/>
         <w:t>Programmer</w:t>
       </w:r>
       <w:r>
@@ -3088,7 +2603,7 @@
           </mc:Choice>
           <mc:Fallback>
             <w:pict>
-              <v:shape w14:anchorId="0FD4D121" id="Graphic 1" o:spid="_x0000_s1026" style="position:absolute;margin-left:46.8pt;margin-top:3.8pt;width:518.45pt;height:.1pt;z-index:-15715840;visibility:visible;mso-wrap-style:square;mso-wrap-distance-left:0;mso-wrap-distance-top:0;mso-wrap-distance-right:0;mso-wrap-distance-bottom:0;mso-position-horizontal:absolute;mso-position-horizontal-relative:page;mso-position-vertical:absolute;mso-position-vertical-relative:text;v-text-anchor:top" coordsize="6584315,1270" o:gfxdata="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" path="m,l6583692,e" filled="f" strokeweight=".14039mm">
+              <v:shape w14:anchorId="003FE109" id="Graphic 1" o:spid="_x0000_s1026" style="position:absolute;margin-left:46.8pt;margin-top:3.8pt;width:518.45pt;height:.1pt;z-index:-15715840;visibility:visible;mso-wrap-style:square;mso-wrap-distance-left:0;mso-wrap-distance-top:0;mso-wrap-distance-right:0;mso-wrap-distance-bottom:0;mso-position-horizontal:absolute;mso-position-horizontal-relative:page;mso-position-vertical:absolute;mso-position-vertical-relative:text;v-text-anchor:top" coordsize="6584315,1270" o:gfxdata="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" path="m,l6583692,e" filled="f" strokeweight=".14039mm">
                 <v:path arrowok="t"/>
                 <w10:wrap type="topAndBottom" anchorx="page"/>
               </v:shape>
@@ -3127,7 +2642,7 @@
         </w:rPr>
         <w:t xml:space="preserve"> </w:t>
       </w:r>
-      <w:hyperlink r:id="rId26" w:history="1">
+      <w:hyperlink r:id="rId18" w:history="1">
         <w:r>
           <w:rPr>
             <w:rStyle w:val="Hyperlink"/>
@@ -3142,7 +2657,7 @@
         </w:rPr>
         <w:t xml:space="preserve"> </w:t>
       </w:r>
-      <w:hyperlink r:id="rId27" w:history="1">
+      <w:hyperlink r:id="rId19" w:history="1">
         <w:r>
           <w:rPr>
             <w:rStyle w:val="Hyperlink"/>
@@ -3157,7 +2672,7 @@
         </w:rPr>
         <w:t xml:space="preserve"> </w:t>
       </w:r>
-      <w:hyperlink r:id="rId28" w:history="1">
+      <w:hyperlink r:id="rId20" w:history="1">
         <w:r>
           <w:rPr>
             <w:rStyle w:val="Hyperlink"/>
@@ -3213,7 +2728,21 @@
         <w:rPr>
           <w:spacing w:val="-2"/>
         </w:rPr>
-        <w:t>like using git alias for safe cloning and an eBPF based solution.</w:t>
+        <w:t xml:space="preserve">like using git alias for safe cloning and an </w:t>
+      </w:r>
+      <w:proofErr w:type="spellStart"/>
+      <w:r>
+        <w:rPr>
+          <w:spacing w:val="-2"/>
+        </w:rPr>
+        <w:t>eBPF</w:t>
+      </w:r>
+      <w:proofErr w:type="spellEnd"/>
+      <w:r>
+        <w:rPr>
+          <w:spacing w:val="-2"/>
+        </w:rPr>
+        <w:t xml:space="preserve"> based solution.</w:t>
       </w:r>
     </w:p>
     <w:p>
@@ -3228,13 +2757,21 @@
           <w:spacing w:val="-2"/>
         </w:rPr>
       </w:pPr>
-      <w:r>
-        <w:rPr>
-          <w:spacing w:val="-2"/>
-        </w:rPr>
-        <w:t xml:space="preserve">Stackoverflow Search Engine </w:t>
-      </w:r>
-      <w:hyperlink r:id="rId29" w:history="1">
+      <w:proofErr w:type="spellStart"/>
+      <w:r>
+        <w:rPr>
+          <w:spacing w:val="-2"/>
+        </w:rPr>
+        <w:t>Stackoverflow</w:t>
+      </w:r>
+      <w:proofErr w:type="spellEnd"/>
+      <w:r>
+        <w:rPr>
+          <w:spacing w:val="-2"/>
+        </w:rPr>
+        <w:t xml:space="preserve"> Search Engine </w:t>
+      </w:r>
+      <w:hyperlink r:id="rId21" w:history="1">
         <w:r>
           <w:rPr>
             <w:rStyle w:val="Hyperlink"/>
@@ -3249,7 +2786,7 @@
         </w:rPr>
         <w:t xml:space="preserve"> </w:t>
       </w:r>
-      <w:hyperlink r:id="rId30" w:history="1">
+      <w:hyperlink r:id="rId22" w:history="1">
         <w:r>
           <w:rPr>
             <w:rStyle w:val="Hyperlink"/>
@@ -3356,7 +2893,7 @@
         </w:rPr>
         <w:t xml:space="preserve">Bangla Caption Generator for Images </w:t>
       </w:r>
-      <w:hyperlink r:id="rId31" w:history="1">
+      <w:hyperlink r:id="rId23" w:history="1">
         <w:r>
           <w:rPr>
             <w:rStyle w:val="Hyperlink"/>
@@ -3485,7 +3022,7 @@
         </w:rPr>
         <w:t xml:space="preserve">Bangla Digit Recognition </w:t>
       </w:r>
-      <w:hyperlink r:id="rId32" w:history="1">
+      <w:hyperlink r:id="rId24" w:history="1">
         <w:r>
           <w:rPr>
             <w:rStyle w:val="Hyperlink"/>
@@ -3624,7 +3161,7 @@
         </w:rPr>
         <w:t xml:space="preserve">TCP Libra </w:t>
       </w:r>
-      <w:hyperlink r:id="rId33" w:history="1">
+      <w:hyperlink r:id="rId25" w:history="1">
         <w:r>
           <w:rPr>
             <w:rStyle w:val="Hyperlink"/>
@@ -3766,7 +3303,7 @@
           <w:spacing w:val="-2"/>
         </w:rPr>
       </w:pPr>
-      <w:hyperlink r:id="rId34" w:history="1">
+      <w:hyperlink r:id="rId26" w:history="1">
         <w:r>
           <w:rPr>
             <w:rStyle w:val="Hyperlink"/>
@@ -3781,7 +3318,7 @@
         </w:rPr>
         <w:t xml:space="preserve">, </w:t>
       </w:r>
-      <w:hyperlink r:id="rId35" w:history="1">
+      <w:hyperlink r:id="rId27" w:history="1">
         <w:r>
           <w:rPr>
             <w:rStyle w:val="Hyperlink"/>
@@ -3796,13 +3333,22 @@
         </w:rPr>
         <w:t xml:space="preserve">, </w:t>
       </w:r>
-      <w:hyperlink r:id="rId36" w:history="1">
+      <w:hyperlink r:id="rId28" w:history="1">
+        <w:proofErr w:type="spellStart"/>
         <w:r>
           <w:rPr>
             <w:rStyle w:val="Hyperlink"/>
             <w:spacing w:val="-2"/>
           </w:rPr>
-          <w:t>nPuzzle (A* Search)</w:t>
+          <w:t>nPuzzle</w:t>
+        </w:r>
+        <w:proofErr w:type="spellEnd"/>
+        <w:r>
+          <w:rPr>
+            <w:rStyle w:val="Hyperlink"/>
+            <w:spacing w:val="-2"/>
+          </w:rPr>
+          <w:t xml:space="preserve"> (A* Search)</w:t>
         </w:r>
       </w:hyperlink>
       <w:r>
@@ -3811,7 +3357,7 @@
         </w:rPr>
         <w:t xml:space="preserve">, </w:t>
       </w:r>
-      <w:hyperlink r:id="rId37" w:history="1">
+      <w:hyperlink r:id="rId29" w:history="1">
         <w:r>
           <w:rPr>
             <w:rStyle w:val="Hyperlink"/>
@@ -3826,7 +3372,7 @@
         </w:rPr>
         <w:t xml:space="preserve">,                    </w:t>
       </w:r>
-      <w:hyperlink r:id="rId38" w:history="1">
+      <w:hyperlink r:id="rId30" w:history="1">
         <w:r>
           <w:rPr>
             <w:rStyle w:val="Hyperlink"/>
@@ -3850,7 +3396,21 @@
           <w:color w:val="EE0000"/>
           <w:w w:val="105"/>
         </w:rPr>
-        <w:t xml:space="preserve">       TECHNICAL SKILLS</w:t>
+        <w:t xml:space="preserve">       </w:t>
+      </w:r>
+      <w:r>
+        <w:rPr>
+          <w:color w:val="EE0000"/>
+          <w:w w:val="105"/>
+        </w:rPr>
+        <w:t xml:space="preserve">  </w:t>
+      </w:r>
+      <w:r>
+        <w:rPr>
+          <w:color w:val="EE0000"/>
+          <w:w w:val="105"/>
+        </w:rPr>
+        <w:t>TECHNICAL SKILLS</w:t>
       </w:r>
     </w:p>
     <w:p>
@@ -3938,7 +3498,7 @@
           </mc:Choice>
           <mc:Fallback>
             <w:pict>
-              <v:shape w14:anchorId="59CD9D66" id="Graphic 1" o:spid="_x0000_s1026" style="position:absolute;margin-left:46.8pt;margin-top:3.8pt;width:518.45pt;height:.1pt;z-index:-15713792;visibility:visible;mso-wrap-style:square;mso-wrap-distance-left:0;mso-wrap-distance-top:0;mso-wrap-distance-right:0;mso-wrap-distance-bottom:0;mso-position-horizontal:absolute;mso-position-horizontal-relative:page;mso-position-vertical:absolute;mso-position-vertical-relative:text;v-text-anchor:top" coordsize="6584315,1270" o:gfxdata="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" path="m,l6583692,e" filled="f" strokeweight=".14039mm">
+              <v:shape w14:anchorId="54F20186" id="Graphic 1" o:spid="_x0000_s1026" style="position:absolute;margin-left:46.8pt;margin-top:3.8pt;width:518.45pt;height:.1pt;z-index:-15713792;visibility:visible;mso-wrap-style:square;mso-wrap-distance-left:0;mso-wrap-distance-top:0;mso-wrap-distance-right:0;mso-wrap-distance-bottom:0;mso-position-horizontal:absolute;mso-position-horizontal-relative:page;mso-position-vertical:absolute;mso-position-vertical-relative:text;v-text-anchor:top" coordsize="6584315,1270" o:gfxdata="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" path="m,l6583692,e" filled="f" strokeweight=".14039mm">
                 <v:path arrowok="t"/>
                 <w10:wrap type="topAndBottom" anchorx="page"/>
               </v:shape>
@@ -4094,13 +3654,41 @@
         </w:rPr>
         <w:t xml:space="preserve">Computer Forensic Tools: </w:t>
       </w:r>
+      <w:proofErr w:type="spellStart"/>
       <w:r>
         <w:rPr>
           <w:rFonts w:eastAsia="Times New Roman" w:cs="Times New Roman"/>
           <w:color w:val="000000"/>
           <w:lang w:bidi="bn-IN"/>
         </w:rPr>
-        <w:t>Strace, Sysdig, Wireshark, New Relic</w:t>
+        <w:t>Strace</w:t>
+      </w:r>
+      <w:proofErr w:type="spellEnd"/>
+      <w:r>
+        <w:rPr>
+          <w:rFonts w:eastAsia="Times New Roman" w:cs="Times New Roman"/>
+          <w:color w:val="000000"/>
+          <w:lang w:bidi="bn-IN"/>
+        </w:rPr>
+        <w:t xml:space="preserve">, </w:t>
+      </w:r>
+      <w:proofErr w:type="spellStart"/>
+      <w:r>
+        <w:rPr>
+          <w:rFonts w:eastAsia="Times New Roman" w:cs="Times New Roman"/>
+          <w:color w:val="000000"/>
+          <w:lang w:bidi="bn-IN"/>
+        </w:rPr>
+        <w:t>Sysdig</w:t>
+      </w:r>
+      <w:proofErr w:type="spellEnd"/>
+      <w:r>
+        <w:rPr>
+          <w:rFonts w:eastAsia="Times New Roman" w:cs="Times New Roman"/>
+          <w:color w:val="000000"/>
+          <w:lang w:bidi="bn-IN"/>
+        </w:rPr>
+        <w:t>, Wireshark, New Relic</w:t>
       </w:r>
     </w:p>
     <w:p>
@@ -4141,6 +3729,334 @@
           <w:lang w:bidi="bn-IN"/>
         </w:rPr>
         <w:t>NS3</w:t>
+      </w:r>
+    </w:p>
+    <w:p>
+      <w:pPr>
+        <w:pStyle w:val="BodyText"/>
+        <w:spacing w:before="60"/>
+        <w:ind w:left="0"/>
+        <w:jc w:val="both"/>
+        <w:rPr>
+          <w:rFonts w:eastAsia="Times New Roman" w:cs="Times New Roman"/>
+          <w:b/>
+          <w:bCs/>
+          <w:color w:val="000000"/>
+          <w:lang w:bidi="bn-IN"/>
+        </w:rPr>
+      </w:pPr>
+    </w:p>
+    <w:p>
+      <w:r>
+        <w:rPr>
+          <w:color w:val="EE0000"/>
+          <w:w w:val="105"/>
+        </w:rPr>
+        <w:t xml:space="preserve">       </w:t>
+      </w:r>
+      <w:r>
+        <w:rPr>
+          <w:color w:val="EE0000"/>
+          <w:w w:val="105"/>
+        </w:rPr>
+        <w:t xml:space="preserve">  </w:t>
+      </w:r>
+      <w:r>
+        <w:rPr>
+          <w:color w:val="EE0000"/>
+          <w:w w:val="105"/>
+        </w:rPr>
+        <w:t>PUBLICATIONS</w:t>
+      </w:r>
+    </w:p>
+    <w:p>
+      <w:pPr>
+        <w:pStyle w:val="BodyText"/>
+        <w:numPr>
+          <w:ilvl w:val="0"/>
+          <w:numId w:val="4"/>
+        </w:numPr>
+        <w:spacing w:before="6"/>
+        <w:rPr>
+          <w:sz w:val="4"/>
+        </w:rPr>
+      </w:pPr>
+      <w:r>
+        <w:rPr>
+          <w:noProof/>
+          <w:sz w:val="4"/>
+        </w:rPr>
+        <mc:AlternateContent>
+          <mc:Choice Requires="wps">
+            <w:drawing>
+              <wp:anchor distT="0" distB="0" distL="0" distR="0" simplePos="0" relativeHeight="487606784" behindDoc="1" locked="0" layoutInCell="1" allowOverlap="1" wp14:anchorId="4208397E" wp14:editId="50925B8F">
+                <wp:simplePos x="0" y="0"/>
+                <wp:positionH relativeFrom="page">
+                  <wp:posOffset>594359</wp:posOffset>
+                </wp:positionH>
+                <wp:positionV relativeFrom="paragraph">
+                  <wp:posOffset>48104</wp:posOffset>
+                </wp:positionV>
+                <wp:extent cx="6584315" cy="1270"/>
+                <wp:effectExtent l="0" t="0" r="0" b="0"/>
+                <wp:wrapTopAndBottom/>
+                <wp:docPr id="1610486620" name="Graphic 1"/>
+                <wp:cNvGraphicFramePr>
+                  <a:graphicFrameLocks xmlns:a="http://schemas.openxmlformats.org/drawingml/2006/main"/>
+                </wp:cNvGraphicFramePr>
+                <a:graphic xmlns:a="http://schemas.openxmlformats.org/drawingml/2006/main">
+                  <a:graphicData uri="http://schemas.microsoft.com/office/word/2010/wordprocessingShape">
+                    <wps:wsp>
+                      <wps:cNvSpPr>
+                        <a:spLocks/>
+                      </wps:cNvSpPr>
+                      <wps:spPr>
+                        <a:xfrm>
+                          <a:off x="0" y="0"/>
+                          <a:ext cx="6584315" cy="1270"/>
+                        </a:xfrm>
+                        <a:custGeom>
+                          <a:avLst/>
+                          <a:gdLst/>
+                          <a:ahLst/>
+                          <a:cxnLst/>
+                          <a:rect l="l" t="t" r="r" b="b"/>
+                          <a:pathLst>
+                            <a:path w="6584315">
+                              <a:moveTo>
+                                <a:pt x="0" y="0"/>
+                              </a:moveTo>
+                              <a:lnTo>
+                                <a:pt x="6583692" y="0"/>
+                              </a:lnTo>
+                            </a:path>
+                          </a:pathLst>
+                        </a:custGeom>
+                        <a:ln w="5054">
+                          <a:solidFill>
+                            <a:srgbClr val="000000"/>
+                          </a:solidFill>
+                          <a:prstDash val="solid"/>
+                        </a:ln>
+                      </wps:spPr>
+                      <wps:bodyPr wrap="square" lIns="0" tIns="0" rIns="0" bIns="0" rtlCol="0">
+                        <a:prstTxWarp prst="textNoShape">
+                          <a:avLst/>
+                        </a:prstTxWarp>
+                        <a:noAutofit/>
+                      </wps:bodyPr>
+                    </wps:wsp>
+                  </a:graphicData>
+                </a:graphic>
+              </wp:anchor>
+            </w:drawing>
+          </mc:Choice>
+          <mc:Fallback>
+            <w:pict>
+              <v:shape w14:anchorId="40A0601E" id="Graphic 1" o:spid="_x0000_s1026" style="position:absolute;margin-left:46.8pt;margin-top:3.8pt;width:518.45pt;height:.1pt;z-index:-15709696;visibility:visible;mso-wrap-style:square;mso-wrap-distance-left:0;mso-wrap-distance-top:0;mso-wrap-distance-right:0;mso-wrap-distance-bottom:0;mso-position-horizontal:absolute;mso-position-horizontal-relative:page;mso-position-vertical:absolute;mso-position-vertical-relative:text;v-text-anchor:top" coordsize="6584315,1270" o:gfxdata="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" path="m,l6583692,e" filled="f" strokeweight=".14039mm">
+                <v:path arrowok="t"/>
+                <w10:wrap type="topAndBottom" anchorx="page"/>
+              </v:shape>
+            </w:pict>
+          </mc:Fallback>
+        </mc:AlternateContent>
+      </w:r>
+    </w:p>
+    <w:p>
+      <w:pPr>
+        <w:pStyle w:val="BodyText"/>
+        <w:numPr>
+          <w:ilvl w:val="0"/>
+          <w:numId w:val="4"/>
+        </w:numPr>
+        <w:spacing w:before="60"/>
+        <w:rPr>
+          <w:spacing w:val="-2"/>
+        </w:rPr>
+      </w:pPr>
+      <w:r>
+        <w:rPr>
+          <w:spacing w:val="-2"/>
+        </w:rPr>
+        <w:t>[Under Review at ACL]</w:t>
+      </w:r>
+      <w:r>
+        <w:rPr>
+          <w:spacing w:val="-2"/>
+        </w:rPr>
+        <w:t xml:space="preserve"> </w:t>
+      </w:r>
+      <w:r>
+        <w:rPr>
+          <w:spacing w:val="-2"/>
+        </w:rPr>
+        <w:t xml:space="preserve">Shahariar, G. M., Nazi, Z. A., </w:t>
+      </w:r>
+      <w:r>
+        <w:rPr>
+          <w:b/>
+          <w:bCs/>
+          <w:spacing w:val="-2"/>
+        </w:rPr>
+        <w:t>Bhuiyan, M. O. H.</w:t>
+      </w:r>
+      <w:r>
+        <w:rPr>
+          <w:spacing w:val="-2"/>
+        </w:rPr>
+        <w:t xml:space="preserve">, &amp; Shi, Z. (2026). </w:t>
+      </w:r>
+    </w:p>
+    <w:p>
+      <w:pPr>
+        <w:pStyle w:val="BodyText"/>
+        <w:spacing w:before="60"/>
+        <w:ind w:left="1165"/>
+        <w:rPr>
+          <w:spacing w:val="-2"/>
+        </w:rPr>
+      </w:pPr>
+      <w:r>
+        <w:rPr>
+          <w:spacing w:val="-2"/>
+        </w:rPr>
+        <w:t xml:space="preserve">PII-VisBench: Evaluating Personally Identifiable Information Safety in Vision Language Models Along </w:t>
+      </w:r>
+    </w:p>
+    <w:p>
+      <w:pPr>
+        <w:pStyle w:val="BodyText"/>
+        <w:spacing w:before="60"/>
+        <w:ind w:left="1165"/>
+        <w:rPr>
+          <w:spacing w:val="-2"/>
+        </w:rPr>
+      </w:pPr>
+      <w:r>
+        <w:rPr>
+          <w:spacing w:val="-2"/>
+        </w:rPr>
+        <w:t>a Continuum of Visibility. arXiv preprint arXiv:2601.05739.</w:t>
+      </w:r>
+    </w:p>
+    <w:p>
+      <w:pPr>
+        <w:pStyle w:val="BodyText"/>
+        <w:numPr>
+          <w:ilvl w:val="0"/>
+          <w:numId w:val="4"/>
+        </w:numPr>
+        <w:spacing w:before="60"/>
+        <w:rPr>
+          <w:spacing w:val="-2"/>
+        </w:rPr>
+      </w:pPr>
+      <w:r>
+        <w:rPr>
+          <w:spacing w:val="-2"/>
+        </w:rPr>
+        <w:t xml:space="preserve">Islam, T., Rigan, M. M. H., </w:t>
+      </w:r>
+      <w:r>
+        <w:rPr>
+          <w:b/>
+          <w:bCs/>
+          <w:spacing w:val="-2"/>
+        </w:rPr>
+        <w:t>Bhuiyan, M. O. H.</w:t>
+      </w:r>
+      <w:r>
+        <w:rPr>
+          <w:spacing w:val="-2"/>
+        </w:rPr>
+        <w:t>, Hashem, T., &amp; Rahman, M. M. (2025). H2opulse: Smartphone-assisted vein evaluation for early recognition of dehydration. </w:t>
+      </w:r>
+      <w:r>
+        <w:rPr>
+          <w:i/>
+          <w:iCs/>
+          <w:spacing w:val="-2"/>
+        </w:rPr>
+        <w:t>Proceedings of the ACM on Interactive, Mobile, Wearable and Ubiquitous Technologies</w:t>
+      </w:r>
+      <w:r>
+        <w:rPr>
+          <w:spacing w:val="-2"/>
+        </w:rPr>
+        <w:t>, </w:t>
+      </w:r>
+      <w:r>
+        <w:rPr>
+          <w:i/>
+          <w:iCs/>
+          <w:spacing w:val="-2"/>
+        </w:rPr>
+        <w:t>9</w:t>
+      </w:r>
+      <w:r>
+        <w:rPr>
+          <w:spacing w:val="-2"/>
+        </w:rPr>
+        <w:t>(2), 1-24.</w:t>
+      </w:r>
+    </w:p>
+    <w:p>
+      <w:pPr>
+        <w:pStyle w:val="BodyText"/>
+        <w:numPr>
+          <w:ilvl w:val="0"/>
+          <w:numId w:val="4"/>
+        </w:numPr>
+        <w:spacing w:before="60"/>
+        <w:jc w:val="both"/>
+        <w:rPr>
+          <w:spacing w:val="-2"/>
+        </w:rPr>
+      </w:pPr>
+      <w:r>
+        <w:rPr>
+          <w:b/>
+          <w:bCs/>
+          <w:spacing w:val="-2"/>
+        </w:rPr>
+        <w:t>Bhuiyan, M. O. H.</w:t>
+      </w:r>
+      <w:r>
+        <w:rPr>
+          <w:spacing w:val="-2"/>
+        </w:rPr>
+        <w:t xml:space="preserve">, Das, S., Majumder, S. H., Majumdar, S., &amp; Hossain, M. S. (2024). On Detecting </w:t>
+      </w:r>
+    </w:p>
+    <w:p>
+      <w:pPr>
+        <w:pStyle w:val="BodyText"/>
+        <w:spacing w:before="60"/>
+        <w:ind w:left="1165"/>
+        <w:jc w:val="both"/>
+        <w:rPr>
+          <w:spacing w:val="-2"/>
+        </w:rPr>
+      </w:pPr>
+      <w:r>
+        <w:rPr>
+          <w:spacing w:val="-2"/>
+        </w:rPr>
+        <w:t>Malicious Code Injection by Monitoring Multi-Level Container Activities. In </w:t>
+      </w:r>
+      <w:r>
+        <w:rPr>
+          <w:i/>
+          <w:iCs/>
+          <w:spacing w:val="-2"/>
+        </w:rPr>
+        <w:t>CLOSER</w:t>
+      </w:r>
+      <w:r>
+        <w:rPr>
+          <w:spacing w:val="-2"/>
+        </w:rPr>
+        <w:t> (pp. 15-26).</w:t>
       </w:r>
     </w:p>
     <w:sectPr>
@@ -5278,6 +5194,119 @@
     </w:lvl>
   </w:abstractNum>
   <w:abstractNum w:abstractNumId="10" w15:restartNumberingAfterBreak="0">
+    <w:nsid w:val="37416964"/>
+    <w:multiLevelType w:val="hybridMultilevel"/>
+    <w:tmpl w:val="90F6C7B0"/>
+    <w:lvl w:ilvl="0" w:tplc="04090001">
+      <w:start w:val="1"/>
+      <w:numFmt w:val="bullet"/>
+      <w:lvlText w:val=""/>
+      <w:lvlJc w:val="left"/>
+      <w:pPr>
+        <w:ind w:left="1263" w:hanging="360"/>
+      </w:pPr>
+      <w:rPr>
+        <w:rFonts w:ascii="Symbol" w:hAnsi="Symbol" w:hint="default"/>
+      </w:rPr>
+    </w:lvl>
+    <w:lvl w:ilvl="1" w:tplc="04090003">
+      <w:start w:val="1"/>
+      <w:numFmt w:val="bullet"/>
+      <w:lvlText w:val="o"/>
+      <w:lvlJc w:val="left"/>
+      <w:pPr>
+        <w:ind w:left="1983" w:hanging="360"/>
+      </w:pPr>
+      <w:rPr>
+        <w:rFonts w:ascii="Courier New" w:hAnsi="Courier New" w:cs="Courier New" w:hint="default"/>
+      </w:rPr>
+    </w:lvl>
+    <w:lvl w:ilvl="2" w:tplc="04090005" w:tentative="1">
+      <w:start w:val="1"/>
+      <w:numFmt w:val="bullet"/>
+      <w:lvlText w:val=""/>
+      <w:lvlJc w:val="left"/>
+      <w:pPr>
+        <w:ind w:left="2703" w:hanging="360"/>
+      </w:pPr>
+      <w:rPr>
+        <w:rFonts w:ascii="Wingdings" w:hAnsi="Wingdings" w:hint="default"/>
+      </w:rPr>
+    </w:lvl>
+    <w:lvl w:ilvl="3" w:tplc="04090001" w:tentative="1">
+      <w:start w:val="1"/>
+      <w:numFmt w:val="bullet"/>
+      <w:lvlText w:val=""/>
+      <w:lvlJc w:val="left"/>
+      <w:pPr>
+        <w:ind w:left="3423" w:hanging="360"/>
+      </w:pPr>
+      <w:rPr>
+        <w:rFonts w:ascii="Symbol" w:hAnsi="Symbol" w:hint="default"/>
+      </w:rPr>
+    </w:lvl>
+    <w:lvl w:ilvl="4" w:tplc="04090003" w:tentative="1">
+      <w:start w:val="1"/>
+      <w:numFmt w:val="bullet"/>
+      <w:lvlText w:val="o"/>
+      <w:lvlJc w:val="left"/>
+      <w:pPr>
+        <w:ind w:left="4143" w:hanging="360"/>
+      </w:pPr>
+      <w:rPr>
+        <w:rFonts w:ascii="Courier New" w:hAnsi="Courier New" w:cs="Courier New" w:hint="default"/>
+      </w:rPr>
+    </w:lvl>
+    <w:lvl w:ilvl="5" w:tplc="04090005" w:tentative="1">
+      <w:start w:val="1"/>
+      <w:numFmt w:val="bullet"/>
+      <w:lvlText w:val=""/>
+      <w:lvlJc w:val="left"/>
+      <w:pPr>
+        <w:ind w:left="4863" w:hanging="360"/>
+      </w:pPr>
+      <w:rPr>
+        <w:rFonts w:ascii="Wingdings" w:hAnsi="Wingdings" w:hint="default"/>
+      </w:rPr>
+    </w:lvl>
+    <w:lvl w:ilvl="6" w:tplc="04090001" w:tentative="1">
+      <w:start w:val="1"/>
+      <w:numFmt w:val="bullet"/>
+      <w:lvlText w:val=""/>
+      <w:lvlJc w:val="left"/>
+      <w:pPr>
+        <w:ind w:left="5583" w:hanging="360"/>
+      </w:pPr>
+      <w:rPr>
+        <w:rFonts w:ascii="Symbol" w:hAnsi="Symbol" w:hint="default"/>
+      </w:rPr>
+    </w:lvl>
+    <w:lvl w:ilvl="7" w:tplc="04090003" w:tentative="1">
+      <w:start w:val="1"/>
+      <w:numFmt w:val="bullet"/>
+      <w:lvlText w:val="o"/>
+      <w:lvlJc w:val="left"/>
+      <w:pPr>
+        <w:ind w:left="6303" w:hanging="360"/>
+      </w:pPr>
+      <w:rPr>
+        <w:rFonts w:ascii="Courier New" w:hAnsi="Courier New" w:cs="Courier New" w:hint="default"/>
+      </w:rPr>
+    </w:lvl>
+    <w:lvl w:ilvl="8" w:tplc="04090005" w:tentative="1">
+      <w:start w:val="1"/>
+      <w:numFmt w:val="bullet"/>
+      <w:lvlText w:val=""/>
+      <w:lvlJc w:val="left"/>
+      <w:pPr>
+        <w:ind w:left="7023" w:hanging="360"/>
+      </w:pPr>
+      <w:rPr>
+        <w:rFonts w:ascii="Wingdings" w:hAnsi="Wingdings" w:hint="default"/>
+      </w:rPr>
+    </w:lvl>
+  </w:abstractNum>
+  <w:abstractNum w:abstractNumId="11" w15:restartNumberingAfterBreak="0">
     <w:nsid w:val="71970819"/>
     <w:multiLevelType w:val="hybridMultilevel"/>
     <w:tmpl w:val="BEC65ACC"/>
@@ -5390,10 +5419,10 @@
       </w:rPr>
     </w:lvl>
   </w:abstractNum>
-  <w:abstractNum w:abstractNumId="11" w15:restartNumberingAfterBreak="0">
+  <w:abstractNum w:abstractNumId="12" w15:restartNumberingAfterBreak="0">
     <w:nsid w:val="7FC4603D"/>
     <w:multiLevelType w:val="hybridMultilevel"/>
-    <w:tmpl w:val="94EA6F96"/>
+    <w:tmpl w:val="187C9262"/>
     <w:lvl w:ilvl="0" w:tplc="04090001">
       <w:start w:val="1"/>
       <w:numFmt w:val="bullet"/>
@@ -5513,7 +5542,7 @@
     <w:abstractNumId w:val="0"/>
   </w:num>
   <w:num w:numId="4" w16cid:durableId="1855144026">
-    <w:abstractNumId w:val="11"/>
+    <w:abstractNumId w:val="12"/>
   </w:num>
   <w:num w:numId="5" w16cid:durableId="1754427493">
     <w:abstractNumId w:val="4"/>
@@ -5537,6 +5566,9 @@
     <w:abstractNumId w:val="7"/>
   </w:num>
   <w:num w:numId="12" w16cid:durableId="1062405823">
+    <w:abstractNumId w:val="11"/>
+  </w:num>
+  <w:num w:numId="13" w16cid:durableId="1678658586">
     <w:abstractNumId w:val="10"/>
   </w:num>
 </w:numbering>
@@ -5977,7 +6009,6 @@
   <w:style w:type="character" w:default="1" w:styleId="DefaultParagraphFont">
     <w:name w:val="Default Paragraph Font"/>
     <w:uiPriority w:val="1"/>
-    <w:semiHidden/>
     <w:unhideWhenUsed/>
   </w:style>
   <w:style w:type="table" w:default="1" w:styleId="TableNormal">
@@ -6004,6 +6035,7 @@
   <w:style w:type="paragraph" w:styleId="BodyText">
     <w:name w:val="Body Text"/>
     <w:basedOn w:val="Normal"/>
+    <w:link w:val="BodyTextChar"/>
     <w:uiPriority w:val="1"/>
     <w:qFormat/>
     <w:pPr>
@@ -6108,6 +6140,16 @@
       <w:color w:val="000000"/>
       <w:sz w:val="22"/>
       <w:szCs w:val="22"/>
+    </w:rPr>
+  </w:style>
+  <w:style w:type="character" w:customStyle="1" w:styleId="BodyTextChar">
+    <w:name w:val="Body Text Char"/>
+    <w:basedOn w:val="DefaultParagraphFont"/>
+    <w:link w:val="BodyText"/>
+    <w:uiPriority w:val="1"/>
+    <w:rsid w:val="006948F7"/>
+    <w:rPr>
+      <w:rFonts w:ascii="Georgia" w:eastAsia="Georgia" w:hAnsi="Georgia" w:cs="Georgia"/>
     </w:rPr>
   </w:style>
 </w:styles>

</xml_diff>